<commit_message>
Added my part to the document
</commit_message>
<xml_diff>
--- a/designReport.docx
+++ b/designReport.docx
@@ -152,7 +152,15 @@
         </w:rPr>
       </w:pPr>
       <w:r>
-        <w:t>Campus Companion app is built to assist students with their daily activities and provide support to any problem that occurs.</w:t>
+        <w:t xml:space="preserve">Campus Companion app is built to assist students with their daily activities and provide support </w:t>
+      </w:r>
+      <w:proofErr w:type="gramStart"/>
+      <w:r>
+        <w:t>to</w:t>
+      </w:r>
+      <w:proofErr w:type="gramEnd"/>
+      <w:r>
+        <w:t xml:space="preserve"> any problem that occurs.</w:t>
       </w:r>
       <w:r>
         <w:rPr>
@@ -169,7 +177,15 @@
         </w:rPr>
       </w:pPr>
       <w:r>
-        <w:t>The system’s inputs are data entered into the system by the user (students), these include personal information like name, date of birth etc., preferences like college activities and societies. These inputs helps the system create a personalized experience for the users.</w:t>
+        <w:t>The system’s inputs are data entered into the system by the user (students), these include personal information like name, date of birth etc., preferences like college activities and societies. These inputs </w:t>
+      </w:r>
+      <w:proofErr w:type="gramStart"/>
+      <w:r>
+        <w:t>helps</w:t>
+      </w:r>
+      <w:proofErr w:type="gramEnd"/>
+      <w:r>
+        <w:t> the system create a personalized experience for the users.</w:t>
       </w:r>
       <w:r>
         <w:rPr>
@@ -186,7 +202,23 @@
         </w:rPr>
       </w:pPr>
       <w:r>
-        <w:t>The system process is how the system handles requests made by the users, like requesting for timetables or searching for an events on campus. For features like reminders or recommendations the system uses the user preferences to give personalized results.</w:t>
+        <w:t>The system process is how the system handles requests made by the users, like requesting for timetables or searching for an </w:t>
+      </w:r>
+      <w:proofErr w:type="gramStart"/>
+      <w:r>
+        <w:t>events</w:t>
+      </w:r>
+      <w:proofErr w:type="gramEnd"/>
+      <w:r>
+        <w:t xml:space="preserve"> on campus. For features like reminders or recommendations the system uses the </w:t>
+      </w:r>
+      <w:proofErr w:type="gramStart"/>
+      <w:r>
+        <w:t>user</w:t>
+      </w:r>
+      <w:proofErr w:type="gramEnd"/>
+      <w:r>
+        <w:t xml:space="preserve"> preferences to give personalized results.</w:t>
       </w:r>
       <w:r>
         <w:rPr>
@@ -203,7 +235,15 @@
         </w:rPr>
       </w:pPr>
       <w:r>
-        <w:t>The system’s outputs are results given to the user from the system. These can include the student’s timetable, personalized recommendations and confirmation messages. Outputs are meant to be clear, easily understandable, and respond to the information provided by the users.</w:t>
+        <w:t xml:space="preserve">The system’s outputs are results given to the user from the system. These can include the </w:t>
+      </w:r>
+      <w:proofErr w:type="gramStart"/>
+      <w:r>
+        <w:t>student’s</w:t>
+      </w:r>
+      <w:proofErr w:type="gramEnd"/>
+      <w:r>
+        <w:t xml:space="preserve"> timetable, personalized recommendations and confirmation messages. Outputs are meant to be clear, easily understandable, and respond to the information provided by the users.</w:t>
       </w:r>
       <w:r>
         <w:rPr>
@@ -252,7 +292,47 @@
         </w:rPr>
       </w:pPr>
       <w:r>
-        <w:t>The system uses a web-based architecture with a client-server model. The client side is built using ‘Next.js’ a react framework which helps us handle the users interface and user interactions, it runs in the web browser and it also communicate with the backend services through API calls.</w:t>
+        <w:t xml:space="preserve">The system uses </w:t>
+      </w:r>
+      <w:proofErr w:type="gramStart"/>
+      <w:r>
+        <w:t>a web</w:t>
+      </w:r>
+      <w:proofErr w:type="gramEnd"/>
+      <w:r>
+        <w:t xml:space="preserve">-based architecture with a client-server model. The client side is built using ‘Next.js’ a </w:t>
+      </w:r>
+      <w:proofErr w:type="gramStart"/>
+      <w:r>
+        <w:t>react</w:t>
+      </w:r>
+      <w:proofErr w:type="gramEnd"/>
+      <w:r>
+        <w:t> framework which helps us handle the </w:t>
+      </w:r>
+      <w:proofErr w:type="gramStart"/>
+      <w:r>
+        <w:t>users</w:t>
+      </w:r>
+      <w:proofErr w:type="gramEnd"/>
+      <w:r>
+        <w:t> interface and user interactions, it runs in the web </w:t>
+      </w:r>
+      <w:proofErr w:type="gramStart"/>
+      <w:r>
+        <w:t>browser</w:t>
+      </w:r>
+      <w:proofErr w:type="gramEnd"/>
+      <w:r>
+        <w:t> and it also </w:t>
+      </w:r>
+      <w:proofErr w:type="gramStart"/>
+      <w:r>
+        <w:t>communicate</w:t>
+      </w:r>
+      <w:proofErr w:type="gramEnd"/>
+      <w:r>
+        <w:t> with the backend services through API calls.</w:t>
       </w:r>
       <w:r>
         <w:rPr>
@@ -269,7 +349,23 @@
         </w:rPr>
       </w:pPr>
       <w:r>
-        <w:t>The backend uses serverless functions like Netlify  Functions or Supabase to process requests made by the user like fetching events dates or submitting forms in the app. This method allows us to reduce the need for managing the servers and allows for more scalable and efficient handling of requests made by users.</w:t>
+        <w:t>The backend uses serverless functions like </w:t>
+      </w:r>
+      <w:proofErr w:type="gramStart"/>
+      <w:r>
+        <w:t>Netlify  Functions</w:t>
+      </w:r>
+      <w:proofErr w:type="gramEnd"/>
+      <w:r>
+        <w:t> or </w:t>
+      </w:r>
+      <w:proofErr w:type="spellStart"/>
+      <w:r>
+        <w:t>Supabase</w:t>
+      </w:r>
+      <w:proofErr w:type="spellEnd"/>
+      <w:r>
+        <w:t> to process requests made by the user like fetching events dates or submitting forms in the app. This method allows us to reduce the need for managing the servers and allows for more scalable and efficient handling of requests made by users.</w:t>
       </w:r>
       <w:r>
         <w:rPr>
@@ -286,7 +382,16 @@
         </w:rPr>
       </w:pPr>
       <w:r>
-        <w:t>The system uses Supabase for the database, where we store fictional data like users, timetables, events, helpdesk tickets and lost &amp; found. The database is made for fast queries and data handling.</w:t>
+        <w:lastRenderedPageBreak/>
+        <w:t>The system uses </w:t>
+      </w:r>
+      <w:proofErr w:type="spellStart"/>
+      <w:r>
+        <w:t>Supabase</w:t>
+      </w:r>
+      <w:proofErr w:type="spellEnd"/>
+      <w:r>
+        <w:t> for the database, where we store fictional data like users, timetables, events, helpdesk tickets and lost &amp; found. The database is made for fast queries and data handling.</w:t>
       </w:r>
       <w:r>
         <w:rPr>
@@ -365,26 +470,23 @@
       <w:pPr>
         <w:jc w:val="both"/>
         <w:rPr>
-          <w:ins w:author="A00020186 Ocean Wojcicki" w:date="2026-04-29T17:51:03.25Z" w16du:dateUtc="2026-04-29T17:51:03.25Z" w:id="1227514816"/>
-        </w:rPr>
-      </w:pPr>
-      <w:ins w:author="A00020186 Ocean Wojcicki" w:date="2026-04-29T17:48:58.962Z" w16du:dateUtc="2026-04-29T17:48:58.962Z" w:id="230400220">
+          <w:ins w:id="0" w:author="A00020186 Ocean Wojcicki" w:date="2026-04-29T17:51:00Z" w16du:dateUtc="2026-04-29T17:51:03Z"/>
+        </w:rPr>
+      </w:pPr>
+      <w:ins w:id="1" w:author="A00020186 Ocean Wojcicki" w:date="2026-04-29T17:48:00Z" w16du:dateUtc="2026-04-29T17:48:58Z">
         <w:r>
           <w:t xml:space="preserve">The key entities we chose to put into the application were a canteen menu, a helpdesk </w:t>
         </w:r>
       </w:ins>
-      <w:ins w:author="A00020186 Ocean Wojcicki" w:date="2026-04-29T17:49:54.881Z" w16du:dateUtc="2026-04-29T17:49:54.881Z" w:id="2091795257">
+      <w:ins w:id="2" w:author="A00020186 Ocean Wojcicki" w:date="2026-04-29T17:49:00Z" w16du:dateUtc="2026-04-29T17:49:54Z">
         <w:r>
           <w:t>and lost &amp; found page, a campus map, a timetable, an events page</w:t>
         </w:r>
         <w:r>
-          <w:t>, and a setting</w:t>
-        </w:r>
-        <w:r>
-          <w:t xml:space="preserve"> page</w:t>
-        </w:r>
-      </w:ins>
-      <w:ins w:author="A00020186 Ocean Wojcicki" w:date="2026-04-29T17:50:44.092Z" w16du:dateUtc="2026-04-29T17:50:44.092Z" w:id="1195230598">
+          <w:t>, and a setting page</w:t>
+        </w:r>
+      </w:ins>
+      <w:ins w:id="3" w:author="A00020186 Ocean Wojcicki" w:date="2026-04-29T17:50:00Z" w16du:dateUtc="2026-04-29T17:50:44Z">
         <w:r>
           <w:t xml:space="preserve">. </w:t>
         </w:r>
@@ -392,50 +494,53 @@
     </w:p>
     <w:p>
       <w:pPr>
-        <w:pStyle w:val="Normal"/>
-        <w:jc w:val="both"/>
-        <w:rPr>
-          <w:ins w:author="A00020186 Ocean Wojcicki" w:date="2026-04-29T18:16:59.824Z" w16du:dateUtc="2026-04-29T18:16:59.824Z" w:id="1948573410"/>
-        </w:rPr>
-      </w:pPr>
-      <w:ins w:author="A00020186 Ocean Wojcicki" w:date="2026-04-29T17:51:58.958Z" w16du:dateUtc="2026-04-29T17:51:58.958Z" w:id="369342102">
+        <w:jc w:val="both"/>
+        <w:rPr>
+          <w:ins w:id="4" w:author="A00020186 Ocean Wojcicki" w:date="2026-04-29T18:16:00Z" w16du:dateUtc="2026-04-29T18:16:59Z"/>
+        </w:rPr>
+      </w:pPr>
+      <w:ins w:id="5" w:author="A00020186 Ocean Wojcicki" w:date="2026-04-29T17:51:00Z" w16du:dateUtc="2026-04-29T17:51:58Z">
         <w:r>
           <w:t xml:space="preserve">For data minimization, we </w:t>
         </w:r>
       </w:ins>
-      <w:ins w:author="A00020186 Ocean Wojcicki" w:date="2026-04-29T18:50:04.792Z" w16du:dateUtc="2026-04-29T18:50:04.792Z" w:id="2120663480">
+      <w:ins w:id="6" w:author="A00020186 Ocean Wojcicki" w:date="2026-04-29T18:50:00Z" w16du:dateUtc="2026-04-29T18:50:04Z">
         <w:r>
           <w:t>won’t</w:t>
         </w:r>
       </w:ins>
-      <w:ins w:author="A00020186 Ocean Wojcicki" w:date="2026-04-29T17:51:58.958Z" w16du:dateUtc="2026-04-29T17:51:58.958Z" w:id="126671170">
+      <w:ins w:id="7" w:author="A00020186 Ocean Wojcicki" w:date="2026-04-29T17:51:00Z" w16du:dateUtc="2026-04-29T17:51:58Z">
         <w:r>
           <w:t xml:space="preserve"> be collecting any personal </w:t>
         </w:r>
+        <w:proofErr w:type="spellStart"/>
         <w:r>
           <w:t>inforamtion</w:t>
         </w:r>
+        <w:proofErr w:type="spellEnd"/>
         <w:r>
           <w:t xml:space="preserve"> that includes a student’s home address, their credit card information, or anything </w:t>
         </w:r>
+        <w:proofErr w:type="spellStart"/>
         <w:r>
           <w:t>thats</w:t>
         </w:r>
+        <w:proofErr w:type="spellEnd"/>
         <w:r>
           <w:t xml:space="preserve"> too sensitive. What the web app will be collecting is only </w:t>
         </w:r>
       </w:ins>
-      <w:ins w:author="A00020186 Ocean Wojcicki" w:date="2026-04-29T17:52:52.717Z" w16du:dateUtc="2026-04-29T17:52:52.717Z" w:id="244245972">
+      <w:ins w:id="8" w:author="A00020186 Ocean Wojcicki" w:date="2026-04-29T17:52:00Z" w16du:dateUtc="2026-04-29T17:52:52Z">
         <w:r>
           <w:t xml:space="preserve">bare </w:t>
         </w:r>
       </w:ins>
-      <w:ins w:author="A00020186 Ocean Wojcicki" w:date="2026-04-29T17:54:58.443Z" w16du:dateUtc="2026-04-29T17:54:58.443Z" w:id="2091631722">
+      <w:ins w:id="9" w:author="A00020186 Ocean Wojcicki" w:date="2026-04-29T17:54:00Z" w16du:dateUtc="2026-04-29T17:54:58Z">
         <w:r>
           <w:t>minimum,</w:t>
         </w:r>
       </w:ins>
-      <w:ins w:author="A00020186 Ocean Wojcicki" w:date="2026-04-29T17:52:52.717Z" w16du:dateUtc="2026-04-29T17:52:52.717Z" w:id="414910328">
+      <w:ins w:id="10" w:author="A00020186 Ocean Wojcicki" w:date="2026-04-29T17:52:00Z" w16du:dateUtc="2026-04-29T17:52:52Z">
         <w:r>
           <w:t xml:space="preserve"> li</w:t>
         </w:r>
@@ -443,7 +548,7 @@
           <w:t xml:space="preserve">ke asking the user for their student email wherever needed. This will be applied to all pages that </w:t>
         </w:r>
       </w:ins>
-      <w:ins w:author="A00020186 Ocean Wojcicki" w:date="2026-04-29T18:46:53.381Z" w16du:dateUtc="2026-04-29T18:46:53.381Z" w:id="1607271640">
+      <w:ins w:id="11" w:author="A00020186 Ocean Wojcicki" w:date="2026-04-29T18:46:00Z" w16du:dateUtc="2026-04-29T18:46:53Z">
         <w:r>
           <w:t>require</w:t>
         </w:r>
@@ -451,28 +556,22 @@
           <w:t xml:space="preserve"> </w:t>
         </w:r>
       </w:ins>
-      <w:ins w:author="A00020186 Ocean Wojcicki" w:date="2026-04-29T17:52:52.717Z" w16du:dateUtc="2026-04-29T17:52:52.717Z" w:id="667040300">
+      <w:ins w:id="12" w:author="A00020186 Ocean Wojcicki" w:date="2026-04-29T17:52:00Z" w16du:dateUtc="2026-04-29T17:52:52Z">
         <w:r>
           <w:t xml:space="preserve">a way </w:t>
         </w:r>
       </w:ins>
-      <w:ins w:author="A00020186 Ocean Wojcicki" w:date="2026-04-29T18:46:55.733Z" w16du:dateUtc="2026-04-29T18:46:55.733Z" w:id="1107182148">
+      <w:ins w:id="13" w:author="A00020186 Ocean Wojcicki" w:date="2026-04-29T18:46:00Z" w16du:dateUtc="2026-04-29T18:46:55Z">
         <w:r>
           <w:t>to give</w:t>
         </w:r>
       </w:ins>
-      <w:ins w:author="A00020186 Ocean Wojcicki" w:date="2026-04-29T17:52:52.717Z" w16du:dateUtc="2026-04-29T17:52:52.717Z" w:id="1899839936">
-        <w:r>
-          <w:t xml:space="preserve"> feedback to the user after they </w:t>
-        </w:r>
-        <w:r>
-          <w:t>submit</w:t>
-        </w:r>
-        <w:r>
-          <w:t xml:space="preserve"> something.</w:t>
-        </w:r>
-      </w:ins>
-      <w:del w:author="A00020186 Ocean Wojcicki" w:date="2026-04-29T18:47:03.129Z" w16du:dateUtc="2026-04-29T18:47:03.129Z" w:id="1003935920">
+      <w:ins w:id="14" w:author="A00020186 Ocean Wojcicki" w:date="2026-04-29T17:52:00Z" w16du:dateUtc="2026-04-29T17:52:52Z">
+        <w:r>
+          <w:t xml:space="preserve"> feedback to the user after they submit something.</w:t>
+        </w:r>
+      </w:ins>
+      <w:del w:id="15" w:author="A00020186 Ocean Wojcicki" w:date="2026-04-29T18:47:00Z" w16du:dateUtc="2026-04-29T18:47:03Z">
         <w:r>
           <w:delText>T</w:delText>
         </w:r>
@@ -480,24 +579,17 @@
     </w:p>
     <w:p>
       <w:pPr>
-        <w:pStyle w:val="Normal"/>
-        <w:jc w:val="both"/>
-        <w:rPr>
-          <w:ins w:author="A00020186 Ocean Wojcicki" w:date="2026-04-29T19:54:12.513Z" w16du:dateUtc="2026-04-29T19:54:12.513Z" w:id="177182644"/>
-        </w:rPr>
-      </w:pPr>
-      <w:ins w:author="A00020186 Ocean Wojcicki" w:date="2026-04-29T18:47:58.413Z" w16du:dateUtc="2026-04-29T18:47:58.413Z" w:id="584577658">
-        <w:r>
-          <w:t xml:space="preserve">For example, when </w:t>
-        </w:r>
-        <w:r>
-          <w:t>submitting</w:t>
-        </w:r>
-        <w:r>
-          <w:t xml:space="preserve"> a ticket on the helpdesk page, it will only ask for a student email and a description of the issue they</w:t>
-        </w:r>
-      </w:ins>
-      <w:ins w:author="A00020186 Ocean Wojcicki" w:date="2026-04-29T18:48:05.737Z" w16du:dateUtc="2026-04-29T18:48:05.737Z" w:id="1099183265">
+        <w:jc w:val="both"/>
+        <w:rPr>
+          <w:ins w:id="16" w:author="A00020186 Ocean Wojcicki" w:date="2026-04-29T19:54:00Z" w16du:dateUtc="2026-04-29T19:54:12Z"/>
+        </w:rPr>
+      </w:pPr>
+      <w:ins w:id="17" w:author="A00020186 Ocean Wojcicki" w:date="2026-04-29T18:47:00Z" w16du:dateUtc="2026-04-29T18:47:58Z">
+        <w:r>
+          <w:t>For example, when submitting a ticket on the helpdesk page, it will only ask for a student email and a description of the issue they</w:t>
+        </w:r>
+      </w:ins>
+      <w:ins w:id="18" w:author="A00020186 Ocean Wojcicki" w:date="2026-04-29T18:48:00Z" w16du:dateUtc="2026-04-29T18:48:05Z">
         <w:r>
           <w:t xml:space="preserve"> have.</w:t>
         </w:r>
@@ -510,25 +602,21 @@
         <w:tblLook w:val="06A0" w:firstRow="1" w:lastRow="0" w:firstColumn="1" w:lastColumn="0" w:noHBand="1" w:noVBand="1"/>
       </w:tblPr>
       <w:tblGrid>
-        <w:gridCol w:w="3120"/>
-        <w:gridCol w:w="3120"/>
-        <w:gridCol w:w="3120"/>
+        <w:gridCol w:w="3117"/>
+        <w:gridCol w:w="3116"/>
+        <w:gridCol w:w="3117"/>
       </w:tblGrid>
       <w:tr>
         <w:trPr>
           <w:trHeight w:val="300"/>
-          <w:ins w:author="A00020186 Ocean Wojcicki" w:date="2026-04-29T20:07:07.061Z" w16du:dateUtc="2026-04-29T20:07:07.061Z" w:id="551604892"/>
+          <w:ins w:id="19" w:author="A00020186 Ocean Wojcicki" w:date="2026-04-29T20:07:00Z"/>
         </w:trPr>
         <w:tc>
           <w:tcPr>
             <w:tcW w:w="3120" w:type="dxa"/>
-            <w:tcMar/>
           </w:tcPr>
           <w:p>
-            <w:pPr>
-              <w:pStyle w:val="Normal"/>
-            </w:pPr>
-            <w:ins w:author="A00020186 Ocean Wojcicki" w:date="2026-04-29T20:07:11.857Z" w16du:dateUtc="2026-04-29T20:07:11.857Z" w:id="1648329482">
+            <w:ins w:id="20" w:author="A00020186 Ocean Wojcicki" w:date="2026-04-29T20:07:00Z" w16du:dateUtc="2026-04-29T20:07:11Z">
               <w:r>
                 <w:t>Entity</w:t>
               </w:r>
@@ -538,18 +626,14 @@
         <w:tc>
           <w:tcPr>
             <w:tcW w:w="3120" w:type="dxa"/>
-            <w:tcMar/>
           </w:tcPr>
           <w:p>
-            <w:pPr>
-              <w:pStyle w:val="Normal"/>
-            </w:pPr>
-            <w:ins w:author="A00020186 Ocean Wojcicki" w:date="2026-04-29T20:07:17.695Z" w16du:dateUtc="2026-04-29T20:07:17.695Z" w:id="1218414990">
+            <w:ins w:id="21" w:author="A00020186 Ocean Wojcicki" w:date="2026-04-29T20:07:00Z" w16du:dateUtc="2026-04-29T20:07:17Z">
               <w:r>
                 <w:t>Attribute</w:t>
               </w:r>
             </w:ins>
-            <w:ins w:author="A00020186 Ocean Wojcicki" w:date="2026-04-29T20:08:03.798Z" w16du:dateUtc="2026-04-29T20:08:03.798Z" w:id="1825012555">
+            <w:ins w:id="22" w:author="A00020186 Ocean Wojcicki" w:date="2026-04-29T20:08:00Z" w16du:dateUtc="2026-04-29T20:08:03Z">
               <w:r>
                 <w:t>s</w:t>
               </w:r>
@@ -559,18 +643,14 @@
         <w:tc>
           <w:tcPr>
             <w:tcW w:w="3120" w:type="dxa"/>
-            <w:tcMar/>
           </w:tcPr>
           <w:p>
-            <w:pPr>
-              <w:pStyle w:val="Normal"/>
-            </w:pPr>
-            <w:ins w:author="A00020186 Ocean Wojcicki" w:date="2026-04-29T20:07:26.252Z" w16du:dateUtc="2026-04-29T20:07:26.252Z" w:id="231447587">
+            <w:ins w:id="23" w:author="A00020186 Ocean Wojcicki" w:date="2026-04-29T20:07:00Z" w16du:dateUtc="2026-04-29T20:07:26Z">
               <w:r>
                 <w:t>Relationship</w:t>
               </w:r>
             </w:ins>
-            <w:ins w:author="A00020186 Ocean Wojcicki" w:date="2026-04-29T20:46:19.75Z" w16du:dateUtc="2026-04-29T20:46:19.75Z" w:id="527826010">
+            <w:ins w:id="24" w:author="A00020186 Ocean Wojcicki" w:date="2026-04-29T20:46:00Z" w16du:dateUtc="2026-04-29T20:46:19Z">
               <w:r>
                 <w:t>s</w:t>
               </w:r>
@@ -581,18 +661,14 @@
       <w:tr>
         <w:trPr>
           <w:trHeight w:val="300"/>
-          <w:ins w:author="A00020186 Ocean Wojcicki" w:date="2026-04-29T20:07:07.061Z" w16du:dateUtc="2026-04-29T20:07:07.061Z" w:id="31540133"/>
+          <w:ins w:id="25" w:author="A00020186 Ocean Wojcicki" w:date="2026-04-29T20:07:00Z"/>
         </w:trPr>
         <w:tc>
           <w:tcPr>
             <w:tcW w:w="3120" w:type="dxa"/>
-            <w:tcMar/>
           </w:tcPr>
           <w:p>
-            <w:pPr>
-              <w:pStyle w:val="Normal"/>
-            </w:pPr>
-            <w:ins w:author="A00020186 Ocean Wojcicki" w:date="2026-04-29T20:07:59.789Z" w16du:dateUtc="2026-04-29T20:07:59.789Z" w:id="1550916465">
+            <w:ins w:id="26" w:author="A00020186 Ocean Wojcicki" w:date="2026-04-29T20:07:00Z" w16du:dateUtc="2026-04-29T20:07:59Z">
               <w:r>
                 <w:t>Timetable</w:t>
               </w:r>
@@ -602,28 +678,24 @@
         <w:tc>
           <w:tcPr>
             <w:tcW w:w="3120" w:type="dxa"/>
-            <w:tcMar/>
           </w:tcPr>
           <w:p>
-            <w:pPr>
-              <w:pStyle w:val="Normal"/>
-            </w:pPr>
-            <w:ins w:author="A00020186 Ocean Wojcicki" w:date="2026-04-29T20:12:49.25Z" w16du:dateUtc="2026-04-29T20:12:49.25Z" w:id="41473284">
+            <w:ins w:id="27" w:author="A00020186 Ocean Wojcicki" w:date="2026-04-29T20:12:00Z" w16du:dateUtc="2026-04-29T20:12:49Z">
               <w:r>
                 <w:t>Course</w:t>
               </w:r>
             </w:ins>
-            <w:ins w:author="A00020186 Ocean Wojcicki" w:date="2026-04-29T20:46:40.072Z" w16du:dateUtc="2026-04-29T20:46:40.072Z" w:id="1003491934">
+            <w:ins w:id="28" w:author="A00020186 Ocean Wojcicki" w:date="2026-04-29T20:46:00Z" w16du:dateUtc="2026-04-29T20:46:40Z">
               <w:r>
                 <w:t xml:space="preserve">, Course Group, </w:t>
               </w:r>
             </w:ins>
-            <w:ins w:author="A00020186 Ocean Wojcicki" w:date="2026-04-29T20:47:41.703Z" w16du:dateUtc="2026-04-29T20:47:41.703Z" w:id="808340282">
+            <w:ins w:id="29" w:author="A00020186 Ocean Wojcicki" w:date="2026-04-29T20:47:00Z" w16du:dateUtc="2026-04-29T20:47:41Z">
               <w:r>
                 <w:t xml:space="preserve">Days of the </w:t>
               </w:r>
             </w:ins>
-            <w:ins w:author="A00020186 Ocean Wojcicki" w:date="2026-04-29T21:12:20.873Z" w16du:dateUtc="2026-04-29T21:12:20.873Z" w:id="1511851932">
+            <w:ins w:id="30" w:author="A00020186 Ocean Wojcicki" w:date="2026-04-29T21:12:00Z" w16du:dateUtc="2026-04-29T21:12:20Z">
               <w:r>
                 <w:t>Week.</w:t>
               </w:r>
@@ -633,24 +705,30 @@
         <w:tc>
           <w:tcPr>
             <w:tcW w:w="3120" w:type="dxa"/>
-            <w:tcMar/>
           </w:tcPr>
           <w:p>
-            <w:pPr>
-              <w:pStyle w:val="Normal"/>
-            </w:pPr>
-            <w:ins w:author="A00020186 Ocean Wojcicki" w:date="2026-04-29T23:05:13.288Z" w16du:dateUtc="2026-04-29T23:05:13.288Z" w:id="614120970">
+            <w:ins w:id="31" w:author="A00020186 Ocean Wojcicki" w:date="2026-04-29T23:05:00Z" w16du:dateUtc="2026-04-29T23:05:13Z">
               <w:r>
-                <w:t xml:space="preserve">One to many </w:t>
+                <w:t xml:space="preserve">One </w:t>
               </w:r>
+              <w:proofErr w:type="gramStart"/>
+              <w:r>
+                <w:t>to</w:t>
+              </w:r>
+              <w:proofErr w:type="gramEnd"/>
+              <w:r>
+                <w:t xml:space="preserve"> many </w:t>
+              </w:r>
+              <w:proofErr w:type="gramStart"/>
               <w:r>
                 <w:t>relationship</w:t>
               </w:r>
+              <w:proofErr w:type="gramEnd"/>
               <w:r>
                 <w:t xml:space="preserve"> between </w:t>
               </w:r>
             </w:ins>
-            <w:ins w:author="A00020186 Ocean Wojcicki" w:date="2026-04-29T23:06:09.594Z" w16du:dateUtc="2026-04-29T23:06:09.594Z" w:id="1365702582">
+            <w:ins w:id="32" w:author="A00020186 Ocean Wojcicki" w:date="2026-04-29T23:06:00Z" w16du:dateUtc="2026-04-29T23:06:09Z">
               <w:r>
                 <w:t>the course and groups.</w:t>
               </w:r>
@@ -661,18 +739,14 @@
       <w:tr>
         <w:trPr>
           <w:trHeight w:val="300"/>
-          <w:ins w:author="A00020186 Ocean Wojcicki" w:date="2026-04-29T20:07:07.061Z" w16du:dateUtc="2026-04-29T20:07:07.061Z" w:id="58353112"/>
+          <w:ins w:id="33" w:author="A00020186 Ocean Wojcicki" w:date="2026-04-29T20:07:00Z"/>
         </w:trPr>
         <w:tc>
           <w:tcPr>
             <w:tcW w:w="3120" w:type="dxa"/>
-            <w:tcMar/>
           </w:tcPr>
           <w:p>
-            <w:pPr>
-              <w:pStyle w:val="Normal"/>
-            </w:pPr>
-            <w:ins w:author="A00020186 Ocean Wojcicki" w:date="2026-04-30T00:57:24.525Z" w16du:dateUtc="2026-04-30T00:57:24.525Z" w:id="537211613">
+            <w:ins w:id="34" w:author="A00020186 Ocean Wojcicki" w:date="2026-04-30T00:57:00Z" w16du:dateUtc="2026-04-30T00:57:24Z">
               <w:r>
                 <w:t>Events</w:t>
               </w:r>
@@ -682,13 +756,9 @@
         <w:tc>
           <w:tcPr>
             <w:tcW w:w="3120" w:type="dxa"/>
-            <w:tcMar/>
           </w:tcPr>
           <w:p>
-            <w:pPr>
-              <w:pStyle w:val="Normal"/>
-            </w:pPr>
-            <w:ins w:author="A00020186 Ocean Wojcicki" w:date="2026-04-30T00:58:21.543Z" w16du:dateUtc="2026-04-30T00:58:21.543Z" w:id="44451146">
+            <w:ins w:id="35" w:author="A00020186 Ocean Wojcicki" w:date="2026-04-30T00:58:00Z" w16du:dateUtc="2026-04-30T00:58:21Z">
               <w:r>
                 <w:t>Date, time, location</w:t>
               </w:r>
@@ -698,30 +768,31 @@
         <w:tc>
           <w:tcPr>
             <w:tcW w:w="3120" w:type="dxa"/>
-            <w:tcMar/>
           </w:tcPr>
           <w:p>
-            <w:pPr>
-              <w:pStyle w:val="Normal"/>
-            </w:pPr>
-            <w:ins w:author="A00020186 Ocean Wojcicki" w:date="2026-04-30T01:08:44.647Z" w16du:dateUtc="2026-04-30T01:08:44.647Z" w:id="1015135803">
+            <w:proofErr w:type="gramStart"/>
+            <w:ins w:id="36" w:author="A00020186 Ocean Wojcicki" w:date="2026-04-30T01:08:00Z" w16du:dateUtc="2026-04-30T01:08:44Z">
               <w:r>
                 <w:t>One</w:t>
               </w:r>
             </w:ins>
-            <w:ins w:author="A00020186 Ocean Wojcicki" w:date="2026-04-30T00:59:50.527Z" w16du:dateUtc="2026-04-30T00:59:50.527Z" w:id="1176573678">
+            <w:ins w:id="37" w:author="A00020186 Ocean Wojcicki" w:date="2026-04-30T00:59:00Z" w16du:dateUtc="2026-04-30T00:59:50Z">
               <w:r>
                 <w:t xml:space="preserve"> </w:t>
               </w:r>
             </w:ins>
-            <w:ins w:author="A00020186 Ocean Wojcicki" w:date="2026-04-30T01:08:44.768Z" w16du:dateUtc="2026-04-30T01:08:44.768Z" w:id="614661433">
+            <w:ins w:id="38" w:author="A00020186 Ocean Wojcicki" w:date="2026-04-30T01:08:00Z" w16du:dateUtc="2026-04-30T01:08:44Z">
               <w:r>
                 <w:t xml:space="preserve"> </w:t>
               </w:r>
             </w:ins>
-            <w:ins w:author="A00020186 Ocean Wojcicki" w:date="2026-04-30T00:59:50.527Z" w16du:dateUtc="2026-04-30T00:59:50.527Z" w:id="1160409935">
+            <w:ins w:id="39" w:author="A00020186 Ocean Wojcicki" w:date="2026-04-30T00:59:00Z" w16du:dateUtc="2026-04-30T00:59:50Z">
               <w:r>
-                <w:t>event can have multiple registrations tied to it</w:t>
+                <w:t>event</w:t>
+              </w:r>
+              <w:proofErr w:type="gramEnd"/>
+              <w:r>
+                <w:t xml:space="preserve"> can have multiple registrations tied to it</w:t>
               </w:r>
             </w:ins>
           </w:p>
@@ -730,18 +801,14 @@
       <w:tr>
         <w:trPr>
           <w:trHeight w:val="300"/>
-          <w:ins w:author="A00020186 Ocean Wojcicki" w:date="2026-04-30T01:12:52.577Z" w16du:dateUtc="2026-04-30T01:12:52.577Z" w:id="104092933"/>
+          <w:ins w:id="40" w:author="A00020186 Ocean Wojcicki" w:date="2026-04-30T01:12:00Z"/>
         </w:trPr>
         <w:tc>
           <w:tcPr>
             <w:tcW w:w="3120" w:type="dxa"/>
-            <w:tcMar/>
           </w:tcPr>
           <w:p>
-            <w:pPr>
-              <w:pStyle w:val="Normal"/>
-            </w:pPr>
-            <w:ins w:author="A00020186 Ocean Wojcicki" w:date="2026-04-30T01:12:57.845Z" w16du:dateUtc="2026-04-30T01:12:57.845Z" w:id="1297385318">
+            <w:ins w:id="41" w:author="A00020186 Ocean Wojcicki" w:date="2026-04-30T01:12:00Z" w16du:dateUtc="2026-04-30T01:12:57Z">
               <w:r>
                 <w:t>Menu</w:t>
               </w:r>
@@ -751,13 +818,9 @@
         <w:tc>
           <w:tcPr>
             <w:tcW w:w="3120" w:type="dxa"/>
-            <w:tcMar/>
           </w:tcPr>
           <w:p>
-            <w:pPr>
-              <w:pStyle w:val="Normal"/>
-            </w:pPr>
-            <w:ins w:author="A00020186 Ocean Wojcicki" w:date="2026-04-30T01:21:23.394Z" w16du:dateUtc="2026-04-30T01:21:23.394Z" w:id="2079660842">
+            <w:ins w:id="42" w:author="A00020186 Ocean Wojcicki" w:date="2026-04-30T01:21:00Z" w16du:dateUtc="2026-04-30T01:21:23Z">
               <w:r>
                 <w:t>Category, Item name, price, allergens</w:t>
               </w:r>
@@ -767,19 +830,17 @@
         <w:tc>
           <w:tcPr>
             <w:tcW w:w="3120" w:type="dxa"/>
-            <w:tcMar/>
           </w:tcPr>
           <w:p>
-            <w:pPr>
-              <w:pStyle w:val="Normal"/>
-            </w:pPr>
-            <w:ins w:author="A00020186 Ocean Wojcicki" w:date="2026-04-30T01:22:57.487Z" w16du:dateUtc="2026-04-30T01:22:57.487Z" w:id="1037037629">
+            <w:ins w:id="43" w:author="A00020186 Ocean Wojcicki" w:date="2026-04-30T01:22:00Z" w16du:dateUtc="2026-04-30T01:22:57Z">
               <w:r>
                 <w:t xml:space="preserve">Another </w:t>
               </w:r>
+              <w:proofErr w:type="gramStart"/>
               <w:r>
                 <w:t>one to many</w:t>
               </w:r>
+              <w:proofErr w:type="gramEnd"/>
               <w:r>
                 <w:t xml:space="preserve"> link between the menu category and the food items. </w:t>
               </w:r>
@@ -791,60 +852,62 @@
     <w:p>
       <w:pPr>
         <w:rPr>
-          <w:del w:author="A00020186 Ocean Wojcicki" w:date="2026-04-30T01:00:18.298Z" w16du:dateUtc="2026-04-30T01:00:18.298Z" w:id="802948383"/>
-        </w:rPr>
-      </w:pPr>
-    </w:p>
-    <w:p>
-      <w:pPr>
-        <w:rPr>
-          <w:ins w:author="A00020186 Ocean Wojcicki" w:date="2026-04-30T01:08:55.099Z" w16du:dateUtc="2026-04-30T01:08:55.099Z" w:id="1724829747"/>
-        </w:rPr>
-      </w:pPr>
-      <w:ins w:author="A00020186 Ocean Wojcicki" w:date="2026-04-30T01:05:59.988Z" w16du:dateUtc="2026-04-30T01:05:59.988Z" w:id="462792612">
+          <w:del w:id="44" w:author="A00020186 Ocean Wojcicki" w:date="2026-04-30T01:00:00Z" w16du:dateUtc="2026-04-30T01:00:18Z"/>
+        </w:rPr>
+      </w:pPr>
+    </w:p>
+    <w:p>
+      <w:pPr>
+        <w:rPr>
+          <w:ins w:id="45" w:author="A00020186 Ocean Wojcicki" w:date="2026-04-30T01:08:00Z" w16du:dateUtc="2026-04-30T01:08:55Z"/>
+        </w:rPr>
+      </w:pPr>
+      <w:proofErr w:type="gramStart"/>
+      <w:ins w:id="46" w:author="A00020186 Ocean Wojcicki" w:date="2026-04-30T01:05:00Z" w16du:dateUtc="2026-04-30T01:05:59Z">
         <w:r>
           <w:t>So</w:t>
         </w:r>
+        <w:proofErr w:type="gramEnd"/>
         <w:r>
           <w:t xml:space="preserve"> </w:t>
         </w:r>
       </w:ins>
-      <w:ins w:author="A00020186 Ocean Wojcicki" w:date="2026-04-30T01:06:58.802Z" w16du:dateUtc="2026-04-30T01:06:58.802Z" w:id="264435982">
+      <w:ins w:id="47" w:author="A00020186 Ocean Wojcicki" w:date="2026-04-30T01:06:00Z" w16du:dateUtc="2026-04-30T01:06:58Z">
         <w:r>
           <w:t xml:space="preserve">the timetable will show options to choose a course, the </w:t>
         </w:r>
       </w:ins>
-      <w:ins w:author="A00020186 Ocean Wojcicki" w:date="2026-04-30T01:09:08.127Z" w16du:dateUtc="2026-04-30T01:09:08.127Z" w:id="1306541083">
+      <w:ins w:id="48" w:author="A00020186 Ocean Wojcicki" w:date="2026-04-30T01:09:00Z" w16du:dateUtc="2026-04-30T01:09:08Z">
         <w:r>
           <w:t>group,</w:t>
         </w:r>
       </w:ins>
-      <w:ins w:author="A00020186 Ocean Wojcicki" w:date="2026-04-30T01:06:58.802Z" w16du:dateUtc="2026-04-30T01:06:58.802Z" w:id="1757843041">
+      <w:ins w:id="49" w:author="A00020186 Ocean Wojcicki" w:date="2026-04-30T01:06:00Z" w16du:dateUtc="2026-04-30T01:06:58Z">
         <w:r>
           <w:t xml:space="preserve"> and a day of the week</w:t>
         </w:r>
       </w:ins>
-      <w:ins w:author="A00020186 Ocean Wojcicki" w:date="2026-04-30T01:07:46.039Z" w16du:dateUtc="2026-04-30T01:07:46.039Z" w:id="254258362">
+      <w:ins w:id="50" w:author="A00020186 Ocean Wojcicki" w:date="2026-04-30T01:07:00Z" w16du:dateUtc="2026-04-30T01:07:46Z">
         <w:r>
           <w:t xml:space="preserve"> for students to see their timetable. There is a “one to many”</w:t>
         </w:r>
       </w:ins>
-      <w:ins w:author="A00020186 Ocean Wojcicki" w:date="2026-04-30T01:07:46.125Z" w16du:dateUtc="2026-04-30T01:07:46.125Z" w:id="1777750009">
+      <w:ins w:id="51" w:author="A00020186 Ocean Wojcicki" w:date="2026-04-30T01:07:00Z" w16du:dateUtc="2026-04-30T01:07:46Z">
         <w:r>
           <w:t xml:space="preserve"> relationship between the course and the groups</w:t>
         </w:r>
       </w:ins>
-      <w:ins w:author="A00020186 Ocean Wojcicki" w:date="2026-04-30T01:08:21.496Z" w16du:dateUtc="2026-04-30T01:08:21.496Z" w:id="1569830203">
+      <w:ins w:id="52" w:author="A00020186 Ocean Wojcicki" w:date="2026-04-30T01:08:00Z" w16du:dateUtc="2026-04-30T01:08:21Z">
         <w:r>
           <w:t xml:space="preserve"> as there </w:t>
         </w:r>
       </w:ins>
-      <w:ins w:author="A00020186 Ocean Wojcicki" w:date="2026-04-30T01:09:26.647Z" w16du:dateUtc="2026-04-30T01:09:26.647Z" w:id="1926351027">
+      <w:ins w:id="53" w:author="A00020186 Ocean Wojcicki" w:date="2026-04-30T01:09:00Z" w16du:dateUtc="2026-04-30T01:09:26Z">
         <w:r>
           <w:t>are multiple</w:t>
         </w:r>
       </w:ins>
-      <w:ins w:author="A00020186 Ocean Wojcicki" w:date="2026-04-30T01:08:21.496Z" w16du:dateUtc="2026-04-30T01:08:21.496Z" w:id="1175782545">
+      <w:ins w:id="54" w:author="A00020186 Ocean Wojcicki" w:date="2026-04-30T01:08:00Z" w16du:dateUtc="2026-04-30T01:08:21Z">
         <w:r>
           <w:t xml:space="preserve"> groups for each course. </w:t>
         </w:r>
@@ -853,29 +916,41 @@
     <w:p>
       <w:pPr>
         <w:rPr>
-          <w:ins w:author="A00020186 Ocean Wojcicki" w:date="2026-04-30T01:23:05.97Z" w16du:dateUtc="2026-04-30T01:23:05.97Z" w:id="1735430214"/>
-        </w:rPr>
-      </w:pPr>
-      <w:ins w:author="A00020186 Ocean Wojcicki" w:date="2026-04-30T01:09:53.181Z" w16du:dateUtc="2026-04-30T01:09:53.181Z" w:id="431729278">
+          <w:ins w:id="55" w:author="A00020186 Ocean Wojcicki" w:date="2026-04-30T01:23:00Z" w16du:dateUtc="2026-04-30T01:23:05Z"/>
+        </w:rPr>
+      </w:pPr>
+      <w:ins w:id="56" w:author="A00020186 Ocean Wojcicki" w:date="2026-04-30T01:09:00Z" w16du:dateUtc="2026-04-30T01:09:53Z">
         <w:r>
           <w:t xml:space="preserve">Another entity will be the </w:t>
         </w:r>
+        <w:proofErr w:type="gramStart"/>
         <w:r>
           <w:t>events,</w:t>
         </w:r>
+        <w:proofErr w:type="gramEnd"/>
         <w:r>
           <w:t xml:space="preserve"> </w:t>
         </w:r>
       </w:ins>
-      <w:ins w:author="A00020186 Ocean Wojcicki" w:date="2026-04-30T01:10:58.826Z" w16du:dateUtc="2026-04-30T01:10:58.826Z" w:id="377002150">
+      <w:ins w:id="57" w:author="A00020186 Ocean Wojcicki" w:date="2026-04-30T01:10:00Z" w16du:dateUtc="2026-04-30T01:10:58Z">
         <w:r>
           <w:t xml:space="preserve">this also has a </w:t>
         </w:r>
+        <w:proofErr w:type="gramStart"/>
         <w:r>
           <w:t>one to many</w:t>
         </w:r>
-        <w:r>
-          <w:t xml:space="preserve"> relationship as one event wi</w:t>
+        <w:proofErr w:type="gramEnd"/>
+        <w:r>
+          <w:t xml:space="preserve"> </w:t>
+        </w:r>
+        <w:proofErr w:type="gramStart"/>
+        <w:r>
+          <w:t>relationship</w:t>
+        </w:r>
+        <w:proofErr w:type="gramEnd"/>
+        <w:r>
+          <w:t xml:space="preserve"> as one event wi</w:t>
         </w:r>
         <w:r>
           <w:t>ll have many students registering for it.</w:t>
@@ -885,41 +960,35 @@
     <w:p>
       <w:pPr>
         <w:rPr>
-          <w:del w:author="A00020186 Ocean Wojcicki" w:date="2026-04-30T01:07:48.388Z" w16du:dateUtc="2026-04-30T01:07:48.388Z" w:id="269819055"/>
-        </w:rPr>
-      </w:pPr>
-      <w:ins w:author="A00020186 Ocean Wojcicki" w:date="2026-04-30T01:23:59.287Z" w16du:dateUtc="2026-04-30T01:23:59.287Z" w:id="88267408">
-        <w:r>
-          <w:t xml:space="preserve">The menu has 2 </w:t>
-        </w:r>
-        <w:r>
-          <w:t>categories, so</w:t>
-        </w:r>
-        <w:r>
-          <w:t xml:space="preserve"> a special menu and an everyday menu.</w:t>
-        </w:r>
-      </w:ins>
-      <w:ins w:author="A00020186 Ocean Wojcicki" w:date="2026-04-30T01:24:20.399Z" w16du:dateUtc="2026-04-30T01:24:20.399Z" w:id="1483858527">
+          <w:del w:id="58" w:author="A00020186 Ocean Wojcicki" w:date="2026-04-30T01:07:00Z" w16du:dateUtc="2026-04-30T01:07:48Z"/>
+        </w:rPr>
+      </w:pPr>
+      <w:ins w:id="59" w:author="A00020186 Ocean Wojcicki" w:date="2026-04-30T01:23:00Z" w16du:dateUtc="2026-04-30T01:23:59Z">
+        <w:r>
+          <w:t>The menu has 2 categories, so a special menu and an everyday menu.</w:t>
+        </w:r>
+      </w:ins>
+      <w:ins w:id="60" w:author="A00020186 Ocean Wojcicki" w:date="2026-04-30T01:24:00Z" w16du:dateUtc="2026-04-30T01:24:20Z">
         <w:r>
           <w:t xml:space="preserve"> Each</w:t>
         </w:r>
       </w:ins>
-      <w:ins w:author="A00020186 Ocean Wojcicki" w:date="2026-04-30T01:23:59.287Z" w16du:dateUtc="2026-04-30T01:23:59.287Z" w:id="1588203675">
+      <w:ins w:id="61" w:author="A00020186 Ocean Wojcicki" w:date="2026-04-30T01:23:00Z" w16du:dateUtc="2026-04-30T01:23:59Z">
         <w:r>
           <w:t xml:space="preserve"> </w:t>
         </w:r>
       </w:ins>
-      <w:ins w:author="A00020186 Ocean Wojcicki" w:date="2026-04-30T01:24:25.89Z" w16du:dateUtc="2026-04-30T01:24:25.89Z" w:id="47041281">
+      <w:ins w:id="62" w:author="A00020186 Ocean Wojcicki" w:date="2026-04-30T01:24:00Z" w16du:dateUtc="2026-04-30T01:24:25Z">
         <w:r>
           <w:t>category</w:t>
         </w:r>
       </w:ins>
-      <w:ins w:author="A00020186 Ocean Wojcicki" w:date="2026-04-30T01:23:59.287Z" w16du:dateUtc="2026-04-30T01:23:59.287Z" w:id="1104264703">
+      <w:ins w:id="63" w:author="A00020186 Ocean Wojcicki" w:date="2026-04-30T01:23:00Z" w16du:dateUtc="2026-04-30T01:23:59Z">
         <w:r>
           <w:t xml:space="preserve"> </w:t>
         </w:r>
       </w:ins>
-      <w:ins w:author="A00020186 Ocean Wojcicki" w:date="2026-04-30T01:24:13.425Z" w16du:dateUtc="2026-04-30T01:24:13.425Z" w:id="1190015130">
+      <w:ins w:id="64" w:author="A00020186 Ocean Wojcicki" w:date="2026-04-30T01:24:00Z" w16du:dateUtc="2026-04-30T01:24:13Z">
         <w:r>
           <w:t>ha</w:t>
         </w:r>
@@ -927,7 +996,7 @@
           <w:t>s</w:t>
         </w:r>
       </w:ins>
-      <w:ins w:author="A00020186 Ocean Wojcicki" w:date="2026-04-30T01:24:43.813Z" w16du:dateUtc="2026-04-30T01:24:43.813Z" w:id="735628440">
+      <w:ins w:id="65" w:author="A00020186 Ocean Wojcicki" w:date="2026-04-30T01:24:00Z" w16du:dateUtc="2026-04-30T01:24:43Z">
         <w:r>
           <w:t xml:space="preserve"> multiple food opt</w:t>
         </w:r>
@@ -941,14 +1010,14 @@
     </w:p>
     <w:p>
       <w:pPr>
-        <w:pStyle w:val="Normal"/>
-        <w:jc w:val="both"/>
-        <w:rPr>
-          <w:del w:author="A00020186 Ocean Wojcicki" w:date="2026-04-29T17:44:11.808Z" w16du:dateUtc="2026-04-29T17:44:11.808Z" w:id="302157140"/>
-        </w:rPr>
-      </w:pPr>
-      <w:del w:author="A00020186 Ocean Wojcicki" w:date="2026-04-29T17:44:11.808Z" w16du:dateUtc="2026-04-29T17:44:11.808Z" w:id="2016612003">
-        <w:r>
+        <w:jc w:val="both"/>
+        <w:rPr>
+          <w:del w:id="66" w:author="A00020186 Ocean Wojcicki" w:date="2026-04-29T17:44:00Z" w16du:dateUtc="2026-04-29T17:44:11Z"/>
+        </w:rPr>
+      </w:pPr>
+      <w:del w:id="67" w:author="A00020186 Ocean Wojcicki" w:date="2026-04-29T17:44:00Z" w16du:dateUtc="2026-04-29T17:44:11Z">
+        <w:r>
+          <w:lastRenderedPageBreak/>
           <w:delText xml:space="preserve">he key entities we chose to </w:delText>
         </w:r>
         <w:r>
@@ -975,53 +1044,142 @@
       <w:pPr>
         <w:jc w:val="both"/>
         <w:rPr>
-          <w:del w:author="A00020186 Ocean Wojcicki" w:date="2026-04-29T17:44:11.808Z" w16du:dateUtc="2026-04-29T17:44:11.808Z" w:id="748214911"/>
-        </w:rPr>
-      </w:pPr>
-      <w:del w:author="A00020186 Ocean Wojcicki" w:date="2026-04-29T19:06:03.826Z" w16du:dateUtc="2026-04-29T19:06:03.826Z" w:id="411976790">
+          <w:del w:id="68" w:author="A00020186 Ocean Wojcicki" w:date="2026-04-29T17:44:00Z" w16du:dateUtc="2026-04-29T17:44:11Z"/>
+        </w:rPr>
+      </w:pPr>
+      <w:del w:id="69" w:author="A00020186 Ocean Wojcicki" w:date="2026-04-29T19:06:00Z" w16du:dateUtc="2026-04-29T19:06:03Z">
         <w:r>
           <w:delText>F</w:delText>
         </w:r>
       </w:del>
-      <w:del w:author="A00020186 Ocean Wojcicki" w:date="2026-04-29T17:44:11.808Z" w16du:dateUtc="2026-04-29T17:44:11.808Z" w:id="96370090">
+      <w:del w:id="70" w:author="A00020186 Ocean Wojcicki" w:date="2026-04-29T17:44:00Z" w16du:dateUtc="2026-04-29T17:44:11Z">
         <w:r>
           <w:delText xml:space="preserve">or data minimization, </w:delText>
         </w:r>
         <w:r>
-          <w:delText xml:space="preserve">we </w:delText>
-        </w:r>
-        <w:r>
-          <w:delText>won't</w:delText>
+          <w:delText xml:space="preserve">we won't </w:delText>
+        </w:r>
+        <w:r>
+          <w:delText>be collecting</w:delText>
+        </w:r>
+        <w:r>
+          <w:delText xml:space="preserve"> any personal information that includes a personal email, phone number</w:delText>
+        </w:r>
+        <w:r>
+          <w:delText>,</w:delText>
+        </w:r>
+        <w:r>
+          <w:delText xml:space="preserve"> or address. </w:delText>
+        </w:r>
+        <w:r>
+          <w:delText xml:space="preserve">What the application will be collecting is only the bare minimum, so our </w:delText>
+        </w:r>
+        <w:r>
+          <w:delText>pages</w:delText>
+        </w:r>
+        <w:r>
+          <w:delText xml:space="preserve"> can be somewhat interactable. </w:delText>
+        </w:r>
+      </w:del>
+    </w:p>
+    <w:p>
+      <w:pPr>
+        <w:jc w:val="both"/>
+        <w:rPr>
+          <w:del w:id="71" w:author="A00020186 Ocean Wojcicki" w:date="2026-04-29T17:44:00Z" w16du:dateUtc="2026-04-29T17:44:11Z"/>
+        </w:rPr>
+      </w:pPr>
+      <w:del w:id="72" w:author="A00020186 Ocean Wojcicki" w:date="2026-04-29T17:44:00Z" w16du:dateUtc="2026-04-29T17:44:11Z">
+        <w:r>
+          <w:delText xml:space="preserve">For example, when we create the helpdesk page, </w:delText>
+        </w:r>
+        <w:r>
+          <w:delText>it</w:delText>
         </w:r>
         <w:r>
           <w:delText xml:space="preserve"> </w:delText>
         </w:r>
         <w:r>
-          <w:delText>be collecting</w:delText>
-        </w:r>
-        <w:r>
-          <w:delText xml:space="preserve"> any personal information that includes a personal email, phone number</w:delText>
+          <w:delText>won’t</w:delText>
+        </w:r>
+        <w:r>
+          <w:delText xml:space="preserve"> be asking for any student</w:delText>
+        </w:r>
+        <w:r>
+          <w:delText xml:space="preserve"> </w:delText>
+        </w:r>
+        <w:r>
+          <w:delText>information</w:delText>
+        </w:r>
+        <w:r>
+          <w:delText>;</w:delText>
+        </w:r>
+        <w:r>
+          <w:delText xml:space="preserve"> </w:delText>
+        </w:r>
+        <w:r>
+          <w:delText>there will</w:delText>
+        </w:r>
+        <w:r>
+          <w:delText xml:space="preserve"> just be a </w:delText>
+        </w:r>
+        <w:r>
+          <w:delText xml:space="preserve">drop-down menu </w:delText>
+        </w:r>
+        <w:r>
+          <w:delText>option to choose the issue and a</w:delText>
+        </w:r>
+        <w:r>
+          <w:delText>n area</w:delText>
+        </w:r>
+        <w:r>
+          <w:delText xml:space="preserve"> to type a short description. </w:delText>
+        </w:r>
+      </w:del>
+    </w:p>
+    <w:p>
+      <w:pPr>
+        <w:jc w:val="both"/>
+        <w:rPr>
+          <w:del w:id="73" w:author="A00020186 Ocean Wojcicki" w:date="2026-04-29T17:44:00Z" w16du:dateUtc="2026-04-29T17:44:11Z"/>
+        </w:rPr>
+      </w:pPr>
+      <w:del w:id="74" w:author="A00020186 Ocean Wojcicki" w:date="2026-04-29T17:44:00Z" w16du:dateUtc="2026-04-29T17:44:11Z">
+        <w:r>
+          <w:delText xml:space="preserve">For the timetable, we will make it so there will be an option to choose what group </w:delText>
+        </w:r>
+        <w:r>
+          <w:delText>you're</w:delText>
+        </w:r>
+        <w:r>
+          <w:delText xml:space="preserve"> in</w:delText>
         </w:r>
         <w:r>
           <w:delText>,</w:delText>
         </w:r>
         <w:r>
-          <w:delText xml:space="preserve"> or address. </w:delText>
-        </w:r>
-        <w:r>
-          <w:delText xml:space="preserve">What the application will be collecting is only the bare minimum, so our </w:delText>
-        </w:r>
-        <w:r>
-          <w:delText>pages</w:delText>
-        </w:r>
-        <w:r>
-          <w:delText xml:space="preserve"> can be </w:delText>
-        </w:r>
-        <w:r>
-          <w:delText>somewhat interactable</w:delText>
-        </w:r>
-        <w:r>
-          <w:delText xml:space="preserve">. </w:delText>
+          <w:delText xml:space="preserve"> and a specified made</w:delText>
+        </w:r>
+        <w:r>
+          <w:delText>-</w:delText>
+        </w:r>
+        <w:r>
+          <w:delText xml:space="preserve">up </w:delText>
+        </w:r>
+        <w:r>
+          <w:delText>timetable</w:delText>
+        </w:r>
+        <w:r>
+          <w:delText xml:space="preserve"> for that </w:delText>
+        </w:r>
+        <w:r>
+          <w:delText xml:space="preserve">group will appear. </w:delText>
+        </w:r>
+        <w:r>
+          <w:delText>No</w:delText>
+        </w:r>
+        <w:r>
+          <w:delText xml:space="preserve"> personal student info will be needed. </w:delText>
         </w:r>
       </w:del>
     </w:p>
@@ -1029,54 +1187,15 @@
       <w:pPr>
         <w:jc w:val="both"/>
         <w:rPr>
-          <w:del w:author="A00020186 Ocean Wojcicki" w:date="2026-04-29T17:44:11.807Z" w16du:dateUtc="2026-04-29T17:44:11.807Z" w:id="324167974"/>
-        </w:rPr>
-      </w:pPr>
-      <w:del w:author="A00020186 Ocean Wojcicki" w:date="2026-04-29T17:44:11.807Z" w16du:dateUtc="2026-04-29T17:44:11.807Z" w:id="135044730">
-        <w:r>
-          <w:delText xml:space="preserve">For example, when we create the helpdesk page, </w:delText>
-        </w:r>
-        <w:r>
-          <w:delText>it</w:delText>
-        </w:r>
-        <w:r>
-          <w:delText xml:space="preserve"> </w:delText>
-        </w:r>
-        <w:r>
-          <w:delText>won’t</w:delText>
-        </w:r>
-        <w:r>
-          <w:delText xml:space="preserve"> be asking for any student</w:delText>
-        </w:r>
-        <w:r>
-          <w:delText xml:space="preserve"> </w:delText>
-        </w:r>
-        <w:r>
-          <w:delText>information</w:delText>
-        </w:r>
-        <w:r>
-          <w:delText>;</w:delText>
-        </w:r>
-        <w:r>
-          <w:delText xml:space="preserve"> </w:delText>
-        </w:r>
-        <w:r>
-          <w:delText>there will</w:delText>
-        </w:r>
-        <w:r>
-          <w:delText xml:space="preserve"> just be a </w:delText>
-        </w:r>
-        <w:r>
-          <w:delText xml:space="preserve">drop-down menu </w:delText>
-        </w:r>
-        <w:r>
-          <w:delText>option to choose the issue and a</w:delText>
-        </w:r>
-        <w:r>
-          <w:delText>n area</w:delText>
-        </w:r>
-        <w:r>
-          <w:delText xml:space="preserve"> to type a short description. </w:delText>
+          <w:del w:id="75" w:author="A00020186 Ocean Wojcicki" w:date="2026-04-29T17:44:00Z" w16du:dateUtc="2026-04-29T17:44:11Z"/>
+        </w:rPr>
+      </w:pPr>
+      <w:del w:id="76" w:author="A00020186 Ocean Wojcicki" w:date="2026-04-29T17:44:00Z" w16du:dateUtc="2026-04-29T17:44:11Z">
+        <w:r>
+          <w:delText xml:space="preserve">For the map, it will only display the area of the fake college with markers randomly placed labelling a building name. </w:delText>
+        </w:r>
+        <w:r>
+          <w:delText>The application won't be asking for a student's location.</w:delText>
         </w:r>
       </w:del>
     </w:p>
@@ -1084,45 +1203,34 @@
       <w:pPr>
         <w:jc w:val="both"/>
         <w:rPr>
-          <w:del w:author="A00020186 Ocean Wojcicki" w:date="2026-04-29T17:44:11.806Z" w16du:dateUtc="2026-04-29T17:44:11.806Z" w:id="1489348577"/>
-        </w:rPr>
-      </w:pPr>
-      <w:del w:author="A00020186 Ocean Wojcicki" w:date="2026-04-29T17:44:11.807Z" w16du:dateUtc="2026-04-29T17:44:11.807Z" w:id="299274469">
-        <w:r>
-          <w:delText xml:space="preserve">For the timetable, we will make it so there will be an option to choose what group </w:delText>
-        </w:r>
-        <w:r>
-          <w:delText>you're</w:delText>
-        </w:r>
-        <w:r>
-          <w:delText xml:space="preserve"> in</w:delText>
-        </w:r>
-        <w:r>
-          <w:delText>,</w:delText>
-        </w:r>
-        <w:r>
-          <w:delText xml:space="preserve"> and a specified made</w:delText>
-        </w:r>
-        <w:r>
-          <w:delText>-</w:delText>
-        </w:r>
-        <w:r>
-          <w:delText xml:space="preserve">up </w:delText>
-        </w:r>
-        <w:r>
-          <w:delText>timetable</w:delText>
-        </w:r>
-        <w:r>
-          <w:delText xml:space="preserve"> for that </w:delText>
-        </w:r>
-        <w:r>
-          <w:delText xml:space="preserve">group will appear. </w:delText>
-        </w:r>
-        <w:r>
-          <w:delText>No</w:delText>
-        </w:r>
-        <w:r>
-          <w:delText xml:space="preserve"> personal student info will be needed. </w:delText>
+          <w:rFonts w:ascii="Aptos" w:eastAsia="Aptos" w:hAnsi="Aptos" w:cs="Aptos"/>
+          <w:color w:val="D13438"/>
+        </w:rPr>
+      </w:pPr>
+      <w:del w:id="77" w:author="A00020186 Ocean Wojcicki" w:date="2026-04-29T17:44:00Z" w16du:dateUtc="2026-04-29T17:44:11Z">
+        <w:r>
+          <w:delText xml:space="preserve">For the lost and found page, we will only </w:delText>
+        </w:r>
+        <w:r>
+          <w:delText>add</w:delText>
+        </w:r>
+        <w:r>
+          <w:delText xml:space="preserve"> an option to </w:delText>
+        </w:r>
+        <w:r>
+          <w:delText>describe</w:delText>
+        </w:r>
+        <w:r>
+          <w:delText xml:space="preserve"> the item </w:delText>
+        </w:r>
+        <w:r>
+          <w:delText xml:space="preserve">or </w:delText>
+        </w:r>
+        <w:r>
+          <w:delText>display a list of made-up</w:delText>
+        </w:r>
+        <w:r>
+          <w:delText xml:space="preserve"> items and add a “claim” button. </w:delText>
         </w:r>
       </w:del>
     </w:p>
@@ -1130,58 +1238,139 @@
       <w:pPr>
         <w:jc w:val="both"/>
         <w:rPr>
-          <w:del w:author="A00020186 Ocean Wojcicki" w:date="2026-04-29T17:44:11.806Z" w16du:dateUtc="2026-04-29T17:44:11.806Z" w:id="1128780855"/>
-        </w:rPr>
-      </w:pPr>
-      <w:del w:author="A00020186 Ocean Wojcicki" w:date="2026-04-29T17:44:11.806Z" w16du:dateUtc="2026-04-29T17:44:11.806Z" w:id="2129136038">
-        <w:r>
-          <w:delText xml:space="preserve">For the map, it will only display the area of the fake college with markers randomly placed labelling a building name. </w:delText>
-        </w:r>
-        <w:r>
-          <w:delText>The application won't be asking for a student's location.</w:delText>
+          <w:sz w:val="28"/>
+          <w:szCs w:val="28"/>
+          <w:u w:val="single"/>
+        </w:rPr>
+      </w:pPr>
+      <w:r>
+        <w:rPr>
+          <w:b/>
+          <w:bCs/>
+          <w:sz w:val="28"/>
+          <w:szCs w:val="28"/>
+          <w:u w:val="single"/>
+        </w:rPr>
+        <w:t>Usability and UI design decisions (navigation, layout consistency, feedback/messages)</w:t>
+      </w:r>
+      <w:r>
+        <w:rPr>
+          <w:b/>
+          <w:bCs/>
+          <w:sz w:val="28"/>
+          <w:szCs w:val="28"/>
+          <w:u w:val="single"/>
+        </w:rPr>
+        <w:t>:</w:t>
+      </w:r>
+    </w:p>
+    <w:p>
+      <w:pPr>
+        <w:jc w:val="both"/>
+      </w:pPr>
+      <w:r>
+        <w:rPr>
+          <w:b/>
+          <w:bCs/>
+        </w:rPr>
+        <w:t>Navigation:</w:t>
+      </w:r>
+    </w:p>
+    <w:p>
+      <w:pPr>
+        <w:jc w:val="both"/>
+      </w:pPr>
+      <w:r>
+        <w:t>The design choices we will implement will be simple for users to easily navigate the application. This will include a navigation bar, buttons on the home page labelled to its destination, clear accessibility like quick links</w:t>
+      </w:r>
+      <w:ins w:id="78" w:author="A00020186 Ocean Wojcicki" w:date="2026-04-30T01:01:00Z" w16du:dateUtc="2026-04-30T01:01:59Z">
+        <w:r>
+          <w:t xml:space="preserve"> across the </w:t>
+        </w:r>
+      </w:ins>
+      <w:ins w:id="79" w:author="A00020186 Ocean Wojcicki" w:date="2026-04-30T01:02:00Z" w16du:dateUtc="2026-04-30T01:02:07Z">
+        <w:r>
+          <w:t>app and inside the footers</w:t>
+        </w:r>
+      </w:ins>
+      <w:r>
+        <w:t>, animations, and user support, etc.</w:t>
+      </w:r>
+    </w:p>
+    <w:p>
+      <w:pPr>
+        <w:jc w:val="both"/>
+      </w:pPr>
+      <w:r>
+        <w:rPr>
+          <w:b/>
+          <w:bCs/>
+        </w:rPr>
+        <w:t>Layout:</w:t>
+      </w:r>
+    </w:p>
+    <w:p>
+      <w:pPr>
+        <w:jc w:val="both"/>
+      </w:pPr>
+      <w:r>
+        <w:t xml:space="preserve">The layout will be consistent </w:t>
+      </w:r>
+      <w:r>
+        <w:t xml:space="preserve">throughout the entire application displaying </w:t>
+      </w:r>
+      <w:r>
+        <w:t xml:space="preserve">a consistent white, blue and grey </w:t>
+      </w:r>
+      <w:proofErr w:type="spellStart"/>
+      <w:r>
+        <w:t>colour</w:t>
+      </w:r>
+      <w:proofErr w:type="spellEnd"/>
+      <w:r>
+        <w:t xml:space="preserve"> </w:t>
+      </w:r>
+      <w:r>
+        <w:t>scheme;</w:t>
+      </w:r>
+      <w:r>
+        <w:t xml:space="preserve"> the font and sizes of text </w:t>
+      </w:r>
+      <w:r>
+        <w:t xml:space="preserve">will </w:t>
+      </w:r>
+      <w:r>
+        <w:t xml:space="preserve">stay the same on every </w:t>
+      </w:r>
+      <w:del w:id="80" w:author="A00020186 Ocean Wojcicki" w:date="2026-04-30T01:02:00Z" w16du:dateUtc="2026-04-30T01:02:45Z">
+        <w:r>
+          <w:delText>page, and</w:delText>
         </w:r>
       </w:del>
-    </w:p>
-    <w:p>
-      <w:pPr>
-        <w:jc w:val="both"/>
-        <w:rPr>
-          <w:rFonts w:ascii="Aptos" w:hAnsi="Aptos" w:eastAsia="Aptos" w:cs="Aptos"/>
-          <w:b w:val="0"/>
-          <w:bCs w:val="0"/>
-          <w:i w:val="0"/>
-          <w:iCs w:val="0"/>
-          <w:noProof w:val="0"/>
-          <w:color w:val="D13438"/>
-          <w:sz w:val="24"/>
-          <w:szCs w:val="24"/>
-          <w:lang w:val="en-US"/>
-        </w:rPr>
-      </w:pPr>
-      <w:del w:author="A00020186 Ocean Wojcicki" w:date="2026-04-29T17:44:11.806Z" w16du:dateUtc="2026-04-29T17:44:11.806Z" w:id="917759027">
-        <w:r>
-          <w:delText xml:space="preserve">For the lost and found page, we will only </w:delText>
-        </w:r>
-        <w:r>
-          <w:delText>add</w:delText>
-        </w:r>
-        <w:r>
-          <w:delText xml:space="preserve"> an option to </w:delText>
-        </w:r>
-        <w:r>
-          <w:delText>describe</w:delText>
-        </w:r>
-        <w:r>
-          <w:delText xml:space="preserve"> the item </w:delText>
-        </w:r>
-        <w:r>
-          <w:delText xml:space="preserve">or </w:delText>
-        </w:r>
-        <w:r>
-          <w:delText>display a list of made-up</w:delText>
-        </w:r>
-        <w:r>
-          <w:delText xml:space="preserve"> items and add a “claim” button. </w:delText>
+      <w:ins w:id="81" w:author="A00020186 Ocean Wojcicki" w:date="2026-04-30T01:02:00Z" w16du:dateUtc="2026-04-30T01:02:45Z">
+        <w:r>
+          <w:t>page and</w:t>
+        </w:r>
+      </w:ins>
+      <w:r>
+        <w:t xml:space="preserve"> </w:t>
+      </w:r>
+      <w:ins w:id="82" w:author="A00020186 Ocean Wojcicki" w:date="2026-04-30T01:02:00Z" w16du:dateUtc="2026-04-30T01:02:58Z">
+        <w:r>
+          <w:t xml:space="preserve">will be compatible </w:t>
+        </w:r>
+        <w:proofErr w:type="gramStart"/>
+        <w:r>
+          <w:t>for</w:t>
+        </w:r>
+        <w:proofErr w:type="gramEnd"/>
+        <w:r>
+          <w:t xml:space="preserve"> those using a phone. </w:t>
+        </w:r>
+      </w:ins>
+      <w:del w:id="83" w:author="A00020186 Ocean Wojcicki" w:date="2026-04-30T01:02:00Z" w16du:dateUtc="2026-04-30T01:02:31Z">
+        <w:r>
+          <w:delText xml:space="preserve">it is compatible for those on a phone. </w:delText>
         </w:r>
       </w:del>
     </w:p>
@@ -1189,28 +1378,124 @@
       <w:pPr>
         <w:jc w:val="both"/>
         <w:rPr>
-          <w:sz w:val="28"/>
-          <w:szCs w:val="28"/>
-          <w:u w:val="single"/>
-        </w:rPr>
-      </w:pPr>
-      <w:r>
-        <w:rPr>
-          <w:b/>
-          <w:bCs/>
-          <w:sz w:val="28"/>
-          <w:szCs w:val="28"/>
-          <w:u w:val="single"/>
-        </w:rPr>
-        <w:t>Usability and UI design decisions (navigation, layout consistency, feedback/messages)</w:t>
-      </w:r>
-      <w:r>
-        <w:rPr>
-          <w:b/>
-          <w:bCs/>
-          <w:sz w:val="28"/>
-          <w:szCs w:val="28"/>
-          <w:u w:val="single"/>
+          <w:b/>
+          <w:bCs/>
+        </w:rPr>
+      </w:pPr>
+      <w:r>
+        <w:rPr>
+          <w:b/>
+          <w:bCs/>
+        </w:rPr>
+        <w:t>Feedback/Messages</w:t>
+      </w:r>
+    </w:p>
+    <w:p>
+      <w:pPr>
+        <w:jc w:val="both"/>
+        <w:rPr>
+          <w:del w:id="84" w:author="A00020186 Ocean Wojcicki" w:date="2026-04-30T01:03:00Z" w16du:dateUtc="2026-04-30T01:03:36Z"/>
+        </w:rPr>
+      </w:pPr>
+      <w:r>
+        <w:t>Users will also be given feedback based on their actions</w:t>
+      </w:r>
+      <w:r>
+        <w:t>. There</w:t>
+      </w:r>
+      <w:r>
+        <w:t xml:space="preserve"> will be animations when clicking buttons, for example a hover effect </w:t>
+      </w:r>
+      <w:r>
+        <w:t xml:space="preserve">causing a pop out animation or a dark </w:t>
+      </w:r>
+      <w:r>
+        <w:t>blue box surrounding the text in the navbar</w:t>
+      </w:r>
+      <w:r>
+        <w:t xml:space="preserve"> indicating that </w:t>
+      </w:r>
+      <w:r>
+        <w:t>it's</w:t>
+      </w:r>
+      <w:r>
+        <w:t xml:space="preserve"> been interacted with. An example of messages being returned would </w:t>
+      </w:r>
+      <w:r>
+        <w:t>be on the lost and found page</w:t>
+      </w:r>
+      <w:r>
+        <w:t>. If the user</w:t>
+      </w:r>
+      <w:r>
+        <w:t xml:space="preserve"> pres</w:t>
+      </w:r>
+      <w:r>
+        <w:t>ses</w:t>
+      </w:r>
+      <w:r>
+        <w:t xml:space="preserve"> “Claim”, </w:t>
+      </w:r>
+      <w:r>
+        <w:lastRenderedPageBreak/>
+        <w:t>it will turn grey with text “Claim requested” preventing them from cl</w:t>
+      </w:r>
+      <w:r>
+        <w:t xml:space="preserve">icking it again. </w:t>
+      </w:r>
+      <w:ins w:id="85" w:author="A00020186 Ocean Wojcicki" w:date="2026-04-30T01:03:00Z" w16du:dateUtc="2026-04-30T01:03:57Z">
+        <w:r>
+          <w:t xml:space="preserve">If a student clicks </w:t>
+        </w:r>
+        <w:r>
+          <w:t xml:space="preserve">“Submit” without </w:t>
+        </w:r>
+      </w:ins>
+      <w:ins w:id="86" w:author="A00020186 Ocean Wojcicki" w:date="2026-04-30T01:25:00Z" w16du:dateUtc="2026-04-30T01:25:52Z">
+        <w:r>
+          <w:t>entering</w:t>
+        </w:r>
+      </w:ins>
+      <w:ins w:id="87" w:author="A00020186 Ocean Wojcicki" w:date="2026-04-30T01:03:00Z" w16du:dateUtc="2026-04-30T01:03:57Z">
+        <w:r>
+          <w:t xml:space="preserve"> their email, they will be told to do so.</w:t>
+        </w:r>
+      </w:ins>
+    </w:p>
+    <w:p>
+      <w:pPr>
+        <w:jc w:val="both"/>
+        <w:rPr>
+          <w:b/>
+          <w:bCs/>
+        </w:rPr>
+      </w:pPr>
+    </w:p>
+    <w:p>
+      <w:pPr>
+        <w:jc w:val="both"/>
+        <w:rPr>
+          <w:b/>
+          <w:bCs/>
+          <w:sz w:val="28"/>
+          <w:szCs w:val="28"/>
+        </w:rPr>
+      </w:pPr>
+      <w:r>
+        <w:rPr>
+          <w:b/>
+          <w:bCs/>
+          <w:sz w:val="28"/>
+          <w:szCs w:val="28"/>
+        </w:rPr>
+        <w:t>Accessibility plan (WCAG-aligned decisions: headings, labels, keyboard navigation, focus states, contrast)</w:t>
+      </w:r>
+      <w:r>
+        <w:rPr>
+          <w:b/>
+          <w:bCs/>
+          <w:sz w:val="28"/>
+          <w:szCs w:val="28"/>
         </w:rPr>
         <w:t>:</w:t>
       </w:r>
@@ -1218,376 +1503,195 @@
     <w:p>
       <w:pPr>
         <w:jc w:val="both"/>
-      </w:pPr>
-      <w:r>
-        <w:rPr>
-          <w:b/>
-          <w:bCs/>
-        </w:rPr>
-        <w:t>Navigation:</w:t>
-      </w:r>
-    </w:p>
-    <w:p>
-      <w:pPr>
-        <w:jc w:val="both"/>
-      </w:pPr>
-      <w:r>
-        <w:rPr/>
-        <w:t>The design choices we will implement will be simple for users to easily navigate the application. This will include a navigation bar, buttons on the home page labelled to its destination, clear accessibility like quick links</w:t>
-      </w:r>
-      <w:ins w:author="A00020186 Ocean Wojcicki" w:date="2026-04-30T01:01:59.958Z" w16du:dateUtc="2026-04-30T01:01:59.958Z" w:id="1004918071">
-        <w:r>
-          <w:t xml:space="preserve"> across the </w:t>
-        </w:r>
-      </w:ins>
-      <w:ins w:author="A00020186 Ocean Wojcicki" w:date="2026-04-30T01:02:07.767Z" w16du:dateUtc="2026-04-30T01:02:07.767Z" w:id="1486276760">
-        <w:r>
-          <w:t>app and inside the footers</w:t>
-        </w:r>
-      </w:ins>
-      <w:r>
-        <w:rPr/>
-        <w:t>, animations, and user support, etc.</w:t>
-      </w:r>
-    </w:p>
-    <w:p>
-      <w:pPr>
-        <w:jc w:val="both"/>
-      </w:pPr>
-      <w:r>
-        <w:rPr>
-          <w:b/>
-          <w:bCs/>
-        </w:rPr>
-        <w:t>Layout:</w:t>
-      </w:r>
-    </w:p>
-    <w:p>
-      <w:pPr>
-        <w:jc w:val="both"/>
-      </w:pPr>
-      <w:r>
-        <w:rPr/>
-        <w:t xml:space="preserve">The layout will be consistent </w:t>
-      </w:r>
-      <w:r>
-        <w:rPr/>
-        <w:t xml:space="preserve">throughout the entire application displaying </w:t>
-      </w:r>
-      <w:r>
-        <w:rPr/>
-        <w:t xml:space="preserve">a consistent white, blue and grey </w:t>
-      </w:r>
-      <w:r>
-        <w:rPr/>
-        <w:t>colour</w:t>
-      </w:r>
-      <w:r>
-        <w:rPr/>
-        <w:t xml:space="preserve"> </w:t>
-      </w:r>
-      <w:r>
-        <w:rPr/>
-        <w:t>scheme;</w:t>
-      </w:r>
-      <w:r>
-        <w:rPr/>
-        <w:t xml:space="preserve"> the font and sizes of text </w:t>
-      </w:r>
-      <w:r>
-        <w:rPr/>
-        <w:t xml:space="preserve">will </w:t>
-      </w:r>
-      <w:r>
-        <w:rPr/>
-        <w:t xml:space="preserve">stay the same on every </w:t>
-      </w:r>
-      <w:del w:author="A00020186 Ocean Wojcicki" w:date="2026-04-30T01:02:45.931Z" w16du:dateUtc="2026-04-30T01:02:45.931Z" w:id="2097256504">
-        <w:r>
-          <w:delText xml:space="preserve">page, </w:delText>
-        </w:r>
-        <w:r>
-          <w:delText>and</w:delText>
-        </w:r>
-      </w:del>
-      <w:ins w:author="A00020186 Ocean Wojcicki" w:date="2026-04-30T01:02:45.932Z" w16du:dateUtc="2026-04-30T01:02:45.932Z" w:id="1320583593">
-        <w:r>
-          <w:t>page and</w:t>
-        </w:r>
-      </w:ins>
-      <w:r>
-        <w:rPr/>
-        <w:t xml:space="preserve"> </w:t>
-      </w:r>
-      <w:ins w:author="A00020186 Ocean Wojcicki" w:date="2026-04-30T01:02:58.659Z" w16du:dateUtc="2026-04-30T01:02:58.659Z" w:id="628991705">
-        <w:r>
-          <w:t>will be co</w:t>
-        </w:r>
-        <w:r>
-          <w:t>mpati</w:t>
-        </w:r>
-        <w:r>
-          <w:t>ble</w:t>
-        </w:r>
-        <w:r>
-          <w:t xml:space="preserve"> for those using a ph</w:t>
-        </w:r>
-        <w:r>
-          <w:t xml:space="preserve">one. </w:t>
-        </w:r>
-      </w:ins>
-      <w:del w:author="A00020186 Ocean Wojcicki" w:date="2026-04-30T01:02:31.932Z" w16du:dateUtc="2026-04-30T01:02:31.932Z" w:id="1340749395">
-        <w:r>
-          <w:delText xml:space="preserve">it is compatible for those on a phone. </w:delText>
-        </w:r>
-      </w:del>
-    </w:p>
-    <w:p>
-      <w:pPr>
-        <w:jc w:val="both"/>
-        <w:rPr>
-          <w:b/>
-          <w:bCs/>
-        </w:rPr>
-      </w:pPr>
-      <w:r>
-        <w:rPr>
-          <w:b/>
-          <w:bCs/>
-        </w:rPr>
-        <w:t>Feedback/Messages</w:t>
-      </w:r>
-    </w:p>
-    <w:p>
-      <w:pPr>
-        <w:jc w:val="both"/>
-        <w:rPr>
-          <w:del w:author="A00020186 Ocean Wojcicki" w:date="2026-04-30T01:03:36.941Z" w16du:dateUtc="2026-04-30T01:03:36.941Z" w:id="634764608"/>
-        </w:rPr>
-      </w:pPr>
-      <w:r>
-        <w:rPr/>
-        <w:t>Users will also be given feedback based on their a</w:t>
-      </w:r>
-      <w:r>
-        <w:rPr/>
-        <w:t>ction</w:t>
-      </w:r>
-      <w:r>
-        <w:rPr/>
-        <w:t>s</w:t>
-      </w:r>
-      <w:r>
-        <w:rPr/>
-        <w:t>. There</w:t>
-      </w:r>
-      <w:r>
-        <w:rPr/>
-        <w:t xml:space="preserve"> will be animat</w:t>
-      </w:r>
-      <w:r>
-        <w:rPr/>
-        <w:t>ions when clic</w:t>
-      </w:r>
-      <w:r>
-        <w:rPr/>
-        <w:t>king buttons, for example a hove</w:t>
-      </w:r>
-      <w:r>
-        <w:rPr/>
-        <w:t>r effe</w:t>
-      </w:r>
-      <w:r>
-        <w:rPr/>
-        <w:t>c</w:t>
-      </w:r>
-      <w:r>
-        <w:rPr/>
-        <w:t xml:space="preserve">t </w:t>
-      </w:r>
-      <w:r>
-        <w:rPr/>
-        <w:t>caus</w:t>
-      </w:r>
-      <w:r>
-        <w:rPr/>
-        <w:t xml:space="preserve">ing a pop out animation or a dark </w:t>
-      </w:r>
-      <w:r>
-        <w:rPr/>
-        <w:t>blue box surrounding the text in the navbar</w:t>
-      </w:r>
-      <w:r>
-        <w:rPr/>
-        <w:t xml:space="preserve"> indicating that </w:t>
-      </w:r>
-      <w:r>
-        <w:rPr/>
-        <w:t>it's</w:t>
-      </w:r>
-      <w:r>
-        <w:rPr/>
-        <w:t xml:space="preserve"> been interacted with. An example of messages being returned would </w:t>
-      </w:r>
-      <w:r>
-        <w:rPr/>
-        <w:t>be on the lost and found page</w:t>
-      </w:r>
-      <w:r>
-        <w:rPr/>
-        <w:t>. If the user</w:t>
-      </w:r>
-      <w:r>
-        <w:rPr/>
-        <w:t xml:space="preserve"> pres</w:t>
-      </w:r>
-      <w:r>
-        <w:rPr/>
-        <w:t>ses</w:t>
-      </w:r>
-      <w:r>
-        <w:rPr/>
-        <w:t xml:space="preserve"> “Claim</w:t>
-      </w:r>
-      <w:r>
-        <w:rPr/>
-        <w:t>”,</w:t>
-      </w:r>
-      <w:r>
-        <w:rPr/>
-        <w:t xml:space="preserve"> it will turn grey with text “Claim requested” preventing them from cl</w:t>
-      </w:r>
-      <w:r>
-        <w:rPr/>
-        <w:t xml:space="preserve">icking it again. </w:t>
-      </w:r>
-      <w:ins w:author="A00020186 Ocean Wojcicki" w:date="2026-04-30T01:03:57.865Z" w16du:dateUtc="2026-04-30T01:03:57.865Z" w:id="1067303716">
-        <w:r>
-          <w:t xml:space="preserve">If a student clicks </w:t>
-        </w:r>
-        <w:r>
-          <w:t xml:space="preserve">“Submit” without </w:t>
-        </w:r>
-      </w:ins>
-      <w:ins w:author="A00020186 Ocean Wojcicki" w:date="2026-04-30T01:25:52.831Z" w16du:dateUtc="2026-04-30T01:25:52.831Z" w:id="376617846">
-        <w:r>
-          <w:t>entering</w:t>
-        </w:r>
-      </w:ins>
-      <w:ins w:author="A00020186 Ocean Wojcicki" w:date="2026-04-30T01:03:57.865Z" w16du:dateUtc="2026-04-30T01:03:57.865Z" w:id="1452536050">
-        <w:r>
-          <w:t xml:space="preserve"> their email,</w:t>
-        </w:r>
-        <w:r>
-          <w:t xml:space="preserve"> </w:t>
-        </w:r>
-        <w:r>
-          <w:t>t</w:t>
-        </w:r>
-        <w:r>
-          <w:t>h</w:t>
-        </w:r>
-        <w:r>
-          <w:t>e</w:t>
-        </w:r>
-        <w:r>
-          <w:t>y</w:t>
-        </w:r>
-        <w:r>
-          <w:t xml:space="preserve"> </w:t>
-        </w:r>
-        <w:r>
-          <w:t>w</w:t>
-        </w:r>
-        <w:r>
-          <w:t>i</w:t>
-        </w:r>
-        <w:r>
-          <w:t>l</w:t>
-        </w:r>
-        <w:r>
-          <w:t>l</w:t>
-        </w:r>
-        <w:r>
-          <w:t xml:space="preserve"> </w:t>
-        </w:r>
-        <w:r>
-          <w:t>b</w:t>
-        </w:r>
-        <w:r>
-          <w:t>e</w:t>
-        </w:r>
-        <w:r>
-          <w:t xml:space="preserve"> </w:t>
-        </w:r>
-        <w:r>
-          <w:t>t</w:t>
-        </w:r>
-        <w:r>
-          <w:t>o</w:t>
-        </w:r>
-        <w:r>
-          <w:t>l</w:t>
-        </w:r>
-        <w:r>
-          <w:t>d</w:t>
-        </w:r>
-        <w:r>
-          <w:t xml:space="preserve"> </w:t>
-        </w:r>
-        <w:r>
-          <w:t>t</w:t>
-        </w:r>
-        <w:r>
-          <w:t>o</w:t>
-        </w:r>
-        <w:r>
-          <w:t xml:space="preserve"> </w:t>
-        </w:r>
-        <w:r>
-          <w:t>d</w:t>
-        </w:r>
-        <w:r>
-          <w:t>o</w:t>
-        </w:r>
-        <w:r>
-          <w:t xml:space="preserve"> </w:t>
-        </w:r>
-        <w:r>
-          <w:t>s</w:t>
-        </w:r>
-        <w:r>
-          <w:t>o.</w:t>
-        </w:r>
-      </w:ins>
-    </w:p>
-    <w:p>
-      <w:pPr>
-        <w:jc w:val="both"/>
-        <w:rPr>
-          <w:b/>
-          <w:bCs/>
-        </w:rPr>
-      </w:pPr>
-    </w:p>
-    <w:p>
-      <w:pPr>
-        <w:jc w:val="both"/>
-        <w:rPr>
-          <w:b/>
-          <w:bCs/>
-          <w:sz w:val="28"/>
-          <w:szCs w:val="28"/>
-        </w:rPr>
-      </w:pPr>
-      <w:r>
-        <w:rPr>
-          <w:b/>
-          <w:bCs/>
-          <w:sz w:val="28"/>
-          <w:szCs w:val="28"/>
-        </w:rPr>
-        <w:t>Accessibility plan (WCAG-aligned decisions: headings, labels, keyboard navigation, focus states, contrast)</w:t>
+        <w:rPr>
+          <w:ins w:id="88" w:author="A00035934 Kevin Ojolowo" w:date="2026-05-01T00:29:00Z"/>
+          <w:color w:val="000000" w:themeColor="text1"/>
+          <w:lang w:val="en-IE"/>
+          <w:rPrChange w:id="89" w:author="A00035934 Kevin Ojolowo" w:date="2026-05-01T00:30:00Z" w16du:dateUtc="2026-04-30T23:30:00Z">
+            <w:rPr>
+              <w:ins w:id="90" w:author="A00035934 Kevin Ojolowo" w:date="2026-05-01T00:29:00Z"/>
+              <w:lang w:val="en-IE"/>
+            </w:rPr>
+          </w:rPrChange>
+        </w:rPr>
+      </w:pPr>
+      <w:ins w:id="91" w:author="A00035934 Kevin Ojolowo" w:date="2026-05-01T00:29:00Z">
+        <w:r>
+          <w:rPr>
+            <w:color w:val="000000" w:themeColor="text1"/>
+            <w:rPrChange w:id="92" w:author="A00035934 Kevin Ojolowo" w:date="2026-05-01T00:30:00Z" w16du:dateUtc="2026-04-30T23:30:00Z">
+              <w:rPr/>
+            </w:rPrChange>
+          </w:rPr>
+          <w:t>A fundamental and essential part of a website is its accessibility features.</w:t>
+        </w:r>
+        <w:r>
+          <w:rPr>
+            <w:color w:val="000000" w:themeColor="text1"/>
+            <w:lang w:val="en-IE"/>
+            <w:rPrChange w:id="93" w:author="A00035934 Kevin Ojolowo" w:date="2026-05-01T00:30:00Z" w16du:dateUtc="2026-04-30T23:30:00Z">
+              <w:rPr>
+                <w:lang w:val="en-IE"/>
+              </w:rPr>
+            </w:rPrChange>
+          </w:rPr>
+          <w:t> </w:t>
+        </w:r>
+      </w:ins>
+    </w:p>
+    <w:p>
+      <w:pPr>
+        <w:jc w:val="both"/>
+        <w:rPr>
+          <w:ins w:id="94" w:author="A00035934 Kevin Ojolowo" w:date="2026-05-01T00:29:00Z"/>
+          <w:lang w:val="en-IE"/>
+        </w:rPr>
+      </w:pPr>
+      <w:ins w:id="95" w:author="A00035934 Kevin Ojolowo" w:date="2026-05-01T00:29:00Z">
+        <w:r>
+          <w:t>The WCAG is the World Content Accessibility Guidelines that helps make the digital world accessible; one of them is websites. Through our thorough hours of research, we concluded that our website must have these main accessibility features that align with WCAG. </w:t>
+        </w:r>
+        <w:r>
+          <w:rPr>
+            <w:lang w:val="en-IE"/>
+          </w:rPr>
+          <w:t> </w:t>
+        </w:r>
+      </w:ins>
+    </w:p>
+    <w:p>
+      <w:pPr>
+        <w:jc w:val="both"/>
+        <w:rPr>
+          <w:ins w:id="96" w:author="A00035934 Kevin Ojolowo" w:date="2026-05-01T00:29:00Z"/>
+          <w:lang w:val="en-IE"/>
+        </w:rPr>
+      </w:pPr>
+      <w:ins w:id="97" w:author="A00035934 Kevin Ojolowo" w:date="2026-05-01T00:29:00Z">
+        <w:r>
+          <w:t xml:space="preserve">Well-structured visible headings are key accessibility features that should be included on all webpages. We added clear headings using h1 and h2 to every page so that it lets users of our website easily understand and navigate every single page a lot more clearly and </w:t>
+        </w:r>
+        <w:proofErr w:type="gramStart"/>
+        <w:r>
+          <w:t>easier</w:t>
+        </w:r>
+        <w:proofErr w:type="gramEnd"/>
+        <w:r>
+          <w:t>. </w:t>
+        </w:r>
+        <w:r>
+          <w:rPr>
+            <w:lang w:val="en-IE"/>
+          </w:rPr>
+          <w:t> </w:t>
+        </w:r>
+      </w:ins>
+    </w:p>
+    <w:p>
+      <w:pPr>
+        <w:jc w:val="both"/>
+        <w:rPr>
+          <w:ins w:id="98" w:author="A00035934 Kevin Ojolowo" w:date="2026-05-01T00:29:00Z"/>
+          <w:lang w:val="en-IE"/>
+        </w:rPr>
+      </w:pPr>
+      <w:ins w:id="99" w:author="A00035934 Kevin Ojolowo" w:date="2026-05-01T00:29:00Z">
+        <w:r>
+          <w:t>A well-made website must have labels to better the website experience for all users, making sure that every input and button is clearly labelled and descriptive; it helps the users drastically, and it makes sure the website is accessible to all.</w:t>
+        </w:r>
+        <w:r>
+          <w:rPr>
+            <w:lang w:val="en-IE"/>
+          </w:rPr>
+          <w:t> </w:t>
+        </w:r>
+      </w:ins>
+    </w:p>
+    <w:p>
+      <w:pPr>
+        <w:jc w:val="both"/>
+        <w:rPr>
+          <w:ins w:id="100" w:author="A00035934 Kevin Ojolowo" w:date="2026-05-01T00:29:00Z"/>
+          <w:lang w:val="en-IE"/>
+        </w:rPr>
+      </w:pPr>
+      <w:ins w:id="101" w:author="A00035934 Kevin Ojolowo" w:date="2026-05-01T00:29:00Z">
+        <w:r>
+          <w:t>To ensure the website meets the full accessibility criteria we know we </w:t>
+        </w:r>
+        <w:proofErr w:type="gramStart"/>
+        <w:r>
+          <w:t>needed</w:t>
+        </w:r>
+        <w:proofErr w:type="gramEnd"/>
+        <w:r>
+          <w:t xml:space="preserve"> to add a lot more features such as keyboard navigation that allows the user to have full navigation with just their keyboard using keys such as tag and enter. The addition of focus states that helps users track navigation and color contrast that helps text become easy to read for users </w:t>
+        </w:r>
+        <w:proofErr w:type="gramStart"/>
+        <w:r>
+          <w:t>to all</w:t>
+        </w:r>
+        <w:proofErr w:type="gramEnd"/>
+        <w:r>
+          <w:t xml:space="preserve"> improve the accessibility of our website for the better.</w:t>
+        </w:r>
+        <w:r>
+          <w:rPr>
+            <w:lang w:val="en-IE"/>
+          </w:rPr>
+          <w:t> </w:t>
+        </w:r>
+      </w:ins>
+    </w:p>
+    <w:p>
+      <w:pPr>
+        <w:jc w:val="both"/>
+        <w:rPr>
+          <w:lang w:val="en-IE"/>
+          <w:rPrChange w:id="102" w:author="A00035934 Kevin Ojolowo" w:date="2026-05-01T00:29:00Z" w16du:dateUtc="2026-04-30T23:29:00Z">
+            <w:rPr/>
+          </w:rPrChange>
+        </w:rPr>
+      </w:pPr>
+    </w:p>
+    <w:p>
+      <w:pPr>
+        <w:jc w:val="both"/>
+        <w:rPr>
+          <w:b/>
+          <w:bCs/>
+          <w:sz w:val="28"/>
+          <w:szCs w:val="28"/>
+        </w:rPr>
+      </w:pPr>
+      <w:r>
+        <w:rPr>
+          <w:b/>
+          <w:bCs/>
+          <w:sz w:val="28"/>
+          <w:szCs w:val="28"/>
+        </w:rPr>
+        <w:t xml:space="preserve">Privacy, security, and compliance (GDPR basics: lawful basis conceptually, </w:t>
+      </w:r>
+      <w:proofErr w:type="spellStart"/>
+      <w:r>
+        <w:rPr>
+          <w:b/>
+          <w:bCs/>
+          <w:sz w:val="28"/>
+          <w:szCs w:val="28"/>
+        </w:rPr>
+        <w:t>minimisation</w:t>
+      </w:r>
+      <w:proofErr w:type="spellEnd"/>
+      <w:r>
+        <w:rPr>
+          <w:b/>
+          <w:bCs/>
+          <w:sz w:val="28"/>
+          <w:szCs w:val="28"/>
+        </w:rPr>
+        <w:t>, retention; risks + mitigations)</w:t>
       </w:r>
       <w:r>
         <w:rPr>
@@ -1603,25 +1707,42 @@
       <w:pPr>
         <w:jc w:val="both"/>
       </w:pPr>
-    </w:p>
-    <w:p>
-      <w:pPr>
-        <w:jc w:val="both"/>
-        <w:rPr>
-          <w:b/>
-          <w:bCs/>
-          <w:sz w:val="28"/>
-          <w:szCs w:val="28"/>
-        </w:rPr>
-      </w:pPr>
-      <w:r>
-        <w:rPr>
-          <w:b/>
-          <w:bCs/>
-          <w:sz w:val="28"/>
-          <w:szCs w:val="28"/>
-        </w:rPr>
-        <w:t>Privacy, security, and compliance (GDPR basics: lawful basis conceptually, minimisation, retention; risks + mitigations)</w:t>
+      <w:ins w:id="103" w:author="A00035934 Kevin Ojolowo" w:date="2026-05-01T00:29:00Z">
+        <w:r>
+          <w:t xml:space="preserve">A big concern for us was making sure we complied with the right privacy and security measures so we could keep our user’s private data protected and </w:t>
+        </w:r>
+        <w:proofErr w:type="gramStart"/>
+        <w:r>
+          <w:t>secured</w:t>
+        </w:r>
+        <w:proofErr w:type="gramEnd"/>
+        <w:r>
+          <w:t>.   </w:t>
+        </w:r>
+        <w:r>
+          <w:br/>
+          <w:t>We only needed to collect data so we could provide our many website features, only the data we needed were collected, so no unnecessary data we collected such as personal information. Our website does not need to keep your data forever for it to function so after a while it gets deleted.  </w:t>
+        </w:r>
+      </w:ins>
+    </w:p>
+    <w:p>
+      <w:pPr>
+        <w:jc w:val="both"/>
+        <w:rPr>
+          <w:b/>
+          <w:bCs/>
+          <w:sz w:val="28"/>
+          <w:szCs w:val="28"/>
+        </w:rPr>
+      </w:pPr>
+      <w:r>
+        <w:rPr>
+          <w:b/>
+          <w:bCs/>
+          <w:sz w:val="28"/>
+          <w:szCs w:val="28"/>
+        </w:rPr>
+        <w:t>Deployment plan (conceptual)</w:t>
       </w:r>
       <w:r>
         <w:rPr>
@@ -1642,47 +1763,14 @@
       <w:pPr>
         <w:jc w:val="both"/>
         <w:rPr>
-          <w:b/>
-          <w:bCs/>
-          <w:sz w:val="28"/>
-          <w:szCs w:val="28"/>
-        </w:rPr>
-      </w:pPr>
-      <w:r>
-        <w:rPr>
-          <w:b/>
-          <w:bCs/>
-          <w:sz w:val="28"/>
-          <w:szCs w:val="28"/>
-        </w:rPr>
-        <w:t>Deployment plan (conceptual)</w:t>
-      </w:r>
-      <w:r>
-        <w:rPr>
-          <w:b/>
-          <w:bCs/>
-          <w:sz w:val="28"/>
-          <w:szCs w:val="28"/>
-        </w:rPr>
-        <w:t>:</w:t>
-      </w:r>
-    </w:p>
-    <w:p>
-      <w:pPr>
-        <w:jc w:val="both"/>
-      </w:pPr>
-    </w:p>
-    <w:p>
-      <w:pPr>
-        <w:jc w:val="both"/>
-        <w:rPr>
-          <w:lang w:val="en-IE"/>
-        </w:rPr>
-      </w:pPr>
-      <w:r>
-        <w:rPr>
-          <w:lang w:val="en-IE"/>
-        </w:rPr>
+          <w:lang w:val="en-IE"/>
+        </w:rPr>
+      </w:pPr>
+      <w:r>
+        <w:rPr>
+          <w:lang w:val="en-IE"/>
+        </w:rPr>
+        <w:lastRenderedPageBreak/>
         <w:t>For our project, our group came up with a 7-stage deployment plan to make sure our companion app runs smoothly.</w:t>
       </w:r>
     </w:p>
@@ -1963,6 +2051,7 @@
         <w:rPr>
           <w:lang w:val="en-IE"/>
         </w:rPr>
+        <w:lastRenderedPageBreak/>
         <w:t>Build and deployment process:</w:t>
       </w:r>
     </w:p>
@@ -2020,11 +2109,6 @@
           <w:lang w:val="en-IE"/>
         </w:rPr>
         <w:br/>
-      </w:r>
-      <w:r>
-        <w:rPr>
-          <w:lang w:val="en-IE"/>
-        </w:rPr>
         <w:t>Hosting and</w:t>
       </w:r>
       <w:r>
@@ -2044,11 +2128,6 @@
           <w:lang w:val="en-IE"/>
         </w:rPr>
         <w:br/>
-      </w:r>
-      <w:r>
-        <w:rPr>
-          <w:lang w:val="en-IE"/>
-        </w:rPr>
         <w:t>Netlify provides you with a live link to an application</w:t>
       </w:r>
       <w:r>
@@ -2184,11 +2263,6 @@
           <w:lang w:val="en-IE"/>
         </w:rPr>
         <w:br/>
-      </w:r>
-      <w:r>
-        <w:rPr>
-          <w:lang w:val="en-IE"/>
-        </w:rPr>
         <w:t>Testing and Maintenance:</w:t>
       </w:r>
     </w:p>
@@ -2236,7 +2310,7 @@
       </w:r>
     </w:p>
     <w:sectPr>
-      <w:pgSz w:w="12240" w:h="15840" w:orient="portrait"/>
+      <w:pgSz w:w="12240" w:h="15840"/>
       <w:pgMar w:top="1440" w:right="1440" w:bottom="1440" w:left="1440" w:header="720" w:footer="720" w:gutter="0"/>
       <w:cols w:space="720"/>
       <w:docGrid w:linePitch="360"/>
@@ -2378,12 +2452,20 @@
 </w:numbering>
 </file>
 
+<file path=word/people.xml><?xml version="1.0" encoding="utf-8"?>
+<w15:people xmlns:wpc="http://schemas.microsoft.com/office/word/2010/wordprocessingCanvas" xmlns:cx="http://schemas.microsoft.com/office/drawing/2014/chartex" xmlns:cx1="http://schemas.microsoft.com/office/drawing/2015/9/8/chartex" xmlns:cx2="http://schemas.microsoft.com/office/drawing/2015/10/21/chartex" xmlns:cx3="http://schemas.microsoft.com/office/drawing/2016/5/9/chartex" xmlns:cx4="http://schemas.microsoft.com/office/drawing/2016/5/10/chartex" xmlns:cx5="http://schemas.microsoft.com/office/drawing/2016/5/11/chartex" xmlns:cx6="http://schemas.microsoft.com/office/drawing/2016/5/12/chartex" xmlns:cx7="http://schemas.microsoft.com/office/drawing/2016/5/13/chartex" xmlns:cx8="http://schemas.microsoft.com/office/drawing/2016/5/14/chartex" xmlns:mc="http://schemas.openxmlformats.org/markup-compatibility/2006" xmlns:aink="http://schemas.microsoft.com/office/drawing/2016/ink" xmlns:am3d="http://schemas.microsoft.com/office/drawing/2017/model3d" xmlns:o="urn:schemas-microsoft-com:office:office" xmlns:oel="http://schemas.microsoft.com/office/2019/extlst" xmlns:r="http://schemas.openxmlformats.org/officeDocument/2006/relationships" xmlns:m="http://schemas.openxmlformats.org/officeDocument/2006/math" xmlns:v="urn:schemas-microsoft-com:vml" xmlns:wp14="http://schemas.microsoft.com/office/word/2010/wordprocessingDrawing" xmlns:wp="http://schemas.openxmlformats.org/drawingml/2006/wordprocessingDrawing" xmlns:w10="urn:schemas-microsoft-com:office:word" xmlns:w="http://schemas.openxmlformats.org/wordprocessingml/2006/main" xmlns:w14="http://schemas.microsoft.com/office/word/2010/wordml" xmlns:w15="http://schemas.microsoft.com/office/word/2012/wordml" xmlns:w16cex="http://schemas.microsoft.com/office/word/2018/wordml/cex" xmlns:w16cid="http://schemas.microsoft.com/office/word/2016/wordml/cid" xmlns:w16="http://schemas.microsoft.com/office/word/2018/wordml" xmlns:w16du="http://schemas.microsoft.com/office/word/2023/wordml/word16du" xmlns:w16sdtdh="http://schemas.microsoft.com/office/word/2020/wordml/sdtdatahash" xmlns:w16sdtfl="http://schemas.microsoft.com/office/word/2024/wordml/sdtformatlock" xmlns:w16se="http://schemas.microsoft.com/office/word/2015/wordml/symex" xmlns:wpg="http://schemas.microsoft.com/office/word/2010/wordprocessingGroup" xmlns:wpi="http://schemas.microsoft.com/office/word/2010/wordprocessingInk" xmlns:wne="http://schemas.microsoft.com/office/word/2006/wordml" xmlns:wps="http://schemas.microsoft.com/office/word/2010/wordprocessingShape" mc:Ignorable="w14 w15 w16se w16cid w16 w16cex w16sdtdh w16sdtfl w16du wp14">
+  <w15:person w15:author="A00035934 Kevin Ojolowo">
+    <w15:presenceInfo w15:providerId="AD" w15:userId="S::A00035934@myTUDublin.ie::3e57e018-dfdf-4dab-b7e1-2213ca63b678"/>
+  </w15:person>
+</w15:people>
+</file>
+
 <file path=word/styles.xml><?xml version="1.0" encoding="utf-8"?>
-<w:styles xmlns:wp14="http://schemas.microsoft.com/office/word/2010/wordprocessingDrawing" xmlns:mc="http://schemas.openxmlformats.org/markup-compatibility/2006" xmlns:r="http://schemas.openxmlformats.org/officeDocument/2006/relationships" xmlns:w="http://schemas.openxmlformats.org/wordprocessingml/2006/main" xmlns:w14="http://schemas.microsoft.com/office/word/2010/wordml" xmlns:w15="http://schemas.microsoft.com/office/word/2012/wordml" xmlns:w16cex="http://schemas.microsoft.com/office/word/2018/wordml/cex" xmlns:w16cid="http://schemas.microsoft.com/office/word/2016/wordml/cid" xmlns:w16="http://schemas.microsoft.com/office/word/2018/wordml" xmlns:w16du="http://schemas.microsoft.com/office/word/2023/wordml/word16du" xmlns:w16sdtdh="http://schemas.microsoft.com/office/word/2020/wordml/sdtdatahash" xmlns:w16sdtfl="http://schemas.microsoft.com/office/word/2024/wordml/sdtformatlock" xmlns:w16se="http://schemas.microsoft.com/office/word/2015/wordml/symex" mc:Ignorable="w14 w15 w16se w16cid w16 w16cex w16sdtdh w16sdtfl w16du wp14">
+<w:styles xmlns:mc="http://schemas.openxmlformats.org/markup-compatibility/2006" xmlns:r="http://schemas.openxmlformats.org/officeDocument/2006/relationships" xmlns:w="http://schemas.openxmlformats.org/wordprocessingml/2006/main" xmlns:w14="http://schemas.microsoft.com/office/word/2010/wordml" xmlns:w15="http://schemas.microsoft.com/office/word/2012/wordml" xmlns:w16cex="http://schemas.microsoft.com/office/word/2018/wordml/cex" xmlns:w16cid="http://schemas.microsoft.com/office/word/2016/wordml/cid" xmlns:w16="http://schemas.microsoft.com/office/word/2018/wordml" xmlns:w16du="http://schemas.microsoft.com/office/word/2023/wordml/word16du" xmlns:w16sdtdh="http://schemas.microsoft.com/office/word/2020/wordml/sdtdatahash" xmlns:w16sdtfl="http://schemas.microsoft.com/office/word/2024/wordml/sdtformatlock" xmlns:w16se="http://schemas.microsoft.com/office/word/2015/wordml/symex" mc:Ignorable="w14 w15 w16se w16cid w16 w16cex w16sdtdh w16sdtfl w16du">
   <w:docDefaults>
     <w:rPrDefault>
       <w:rPr>
-        <w:rFonts w:asciiTheme="minorHAnsi" w:hAnsiTheme="minorHAnsi" w:eastAsiaTheme="minorEastAsia" w:cstheme="minorBidi"/>
+        <w:rFonts w:asciiTheme="minorHAnsi" w:eastAsiaTheme="minorEastAsia" w:hAnsiTheme="minorHAnsi" w:cstheme="minorBidi"/>
         <w:sz w:val="24"/>
         <w:szCs w:val="24"/>
         <w:lang w:val="en-US" w:eastAsia="ja-JP" w:bidi="ar-SA"/>
@@ -2398,14 +2480,14 @@
   <w:latentStyles w:defLockedState="0" w:defUIPriority="99" w:defSemiHidden="0" w:defUnhideWhenUsed="0" w:defQFormat="0" w:count="376">
     <w:lsdException w:name="Normal" w:uiPriority="0" w:qFormat="1"/>
     <w:lsdException w:name="heading 1" w:uiPriority="9" w:qFormat="1"/>
-    <w:lsdException w:name="heading 2" w:uiPriority="9" w:semiHidden="1" w:unhideWhenUsed="1" w:qFormat="1"/>
-    <w:lsdException w:name="heading 3" w:uiPriority="9" w:semiHidden="1" w:unhideWhenUsed="1" w:qFormat="1"/>
-    <w:lsdException w:name="heading 4" w:uiPriority="9" w:semiHidden="1" w:unhideWhenUsed="1" w:qFormat="1"/>
-    <w:lsdException w:name="heading 5" w:uiPriority="9" w:semiHidden="1" w:unhideWhenUsed="1" w:qFormat="1"/>
-    <w:lsdException w:name="heading 6" w:uiPriority="9" w:semiHidden="1" w:unhideWhenUsed="1" w:qFormat="1"/>
-    <w:lsdException w:name="heading 7" w:uiPriority="9" w:semiHidden="1" w:unhideWhenUsed="1" w:qFormat="1"/>
-    <w:lsdException w:name="heading 8" w:uiPriority="9" w:semiHidden="1" w:unhideWhenUsed="1" w:qFormat="1"/>
-    <w:lsdException w:name="heading 9" w:uiPriority="9" w:semiHidden="1" w:unhideWhenUsed="1" w:qFormat="1"/>
+    <w:lsdException w:name="heading 2" w:semiHidden="1" w:uiPriority="9" w:unhideWhenUsed="1" w:qFormat="1"/>
+    <w:lsdException w:name="heading 3" w:semiHidden="1" w:uiPriority="9" w:unhideWhenUsed="1" w:qFormat="1"/>
+    <w:lsdException w:name="heading 4" w:semiHidden="1" w:uiPriority="9" w:unhideWhenUsed="1" w:qFormat="1"/>
+    <w:lsdException w:name="heading 5" w:semiHidden="1" w:uiPriority="9" w:unhideWhenUsed="1" w:qFormat="1"/>
+    <w:lsdException w:name="heading 6" w:semiHidden="1" w:uiPriority="9" w:unhideWhenUsed="1" w:qFormat="1"/>
+    <w:lsdException w:name="heading 7" w:semiHidden="1" w:uiPriority="9" w:unhideWhenUsed="1" w:qFormat="1"/>
+    <w:lsdException w:name="heading 8" w:semiHidden="1" w:uiPriority="9" w:unhideWhenUsed="1" w:qFormat="1"/>
+    <w:lsdException w:name="heading 9" w:semiHidden="1" w:uiPriority="9" w:unhideWhenUsed="1" w:qFormat="1"/>
     <w:lsdException w:name="index 1" w:semiHidden="1" w:unhideWhenUsed="1"/>
     <w:lsdException w:name="index 2" w:semiHidden="1" w:unhideWhenUsed="1"/>
     <w:lsdException w:name="index 3" w:semiHidden="1" w:unhideWhenUsed="1"/>
@@ -2415,22 +2497,22 @@
     <w:lsdException w:name="index 7" w:semiHidden="1" w:unhideWhenUsed="1"/>
     <w:lsdException w:name="index 8" w:semiHidden="1" w:unhideWhenUsed="1"/>
     <w:lsdException w:name="index 9" w:semiHidden="1" w:unhideWhenUsed="1"/>
-    <w:lsdException w:name="toc 1" w:uiPriority="39" w:semiHidden="1" w:unhideWhenUsed="1"/>
-    <w:lsdException w:name="toc 2" w:uiPriority="39" w:semiHidden="1" w:unhideWhenUsed="1"/>
-    <w:lsdException w:name="toc 3" w:uiPriority="39" w:semiHidden="1" w:unhideWhenUsed="1"/>
-    <w:lsdException w:name="toc 4" w:uiPriority="39" w:semiHidden="1" w:unhideWhenUsed="1"/>
-    <w:lsdException w:name="toc 5" w:uiPriority="39" w:semiHidden="1" w:unhideWhenUsed="1"/>
-    <w:lsdException w:name="toc 6" w:uiPriority="39" w:semiHidden="1" w:unhideWhenUsed="1"/>
-    <w:lsdException w:name="toc 7" w:uiPriority="39" w:semiHidden="1" w:unhideWhenUsed="1"/>
-    <w:lsdException w:name="toc 8" w:uiPriority="39" w:semiHidden="1" w:unhideWhenUsed="1"/>
-    <w:lsdException w:name="toc 9" w:uiPriority="39" w:semiHidden="1" w:unhideWhenUsed="1"/>
+    <w:lsdException w:name="toc 1" w:semiHidden="1" w:uiPriority="39" w:unhideWhenUsed="1"/>
+    <w:lsdException w:name="toc 2" w:semiHidden="1" w:uiPriority="39" w:unhideWhenUsed="1"/>
+    <w:lsdException w:name="toc 3" w:semiHidden="1" w:uiPriority="39" w:unhideWhenUsed="1"/>
+    <w:lsdException w:name="toc 4" w:semiHidden="1" w:uiPriority="39" w:unhideWhenUsed="1"/>
+    <w:lsdException w:name="toc 5" w:semiHidden="1" w:uiPriority="39" w:unhideWhenUsed="1"/>
+    <w:lsdException w:name="toc 6" w:semiHidden="1" w:uiPriority="39" w:unhideWhenUsed="1"/>
+    <w:lsdException w:name="toc 7" w:semiHidden="1" w:uiPriority="39" w:unhideWhenUsed="1"/>
+    <w:lsdException w:name="toc 8" w:semiHidden="1" w:uiPriority="39" w:unhideWhenUsed="1"/>
+    <w:lsdException w:name="toc 9" w:semiHidden="1" w:uiPriority="39" w:unhideWhenUsed="1"/>
     <w:lsdException w:name="Normal Indent" w:semiHidden="1" w:unhideWhenUsed="1"/>
     <w:lsdException w:name="footnote text" w:semiHidden="1" w:unhideWhenUsed="1"/>
     <w:lsdException w:name="annotation text" w:semiHidden="1" w:unhideWhenUsed="1"/>
     <w:lsdException w:name="header" w:semiHidden="1" w:unhideWhenUsed="1"/>
     <w:lsdException w:name="footer" w:semiHidden="1" w:unhideWhenUsed="1"/>
     <w:lsdException w:name="index heading" w:semiHidden="1" w:unhideWhenUsed="1"/>
-    <w:lsdException w:name="caption" w:uiPriority="35" w:semiHidden="1" w:unhideWhenUsed="1" w:qFormat="1"/>
+    <w:lsdException w:name="caption" w:semiHidden="1" w:uiPriority="35" w:unhideWhenUsed="1" w:qFormat="1"/>
     <w:lsdException w:name="table of figures" w:semiHidden="1" w:unhideWhenUsed="1"/>
     <w:lsdException w:name="envelope address" w:semiHidden="1" w:unhideWhenUsed="1"/>
     <w:lsdException w:name="envelope return" w:semiHidden="1" w:unhideWhenUsed="1"/>
@@ -2461,7 +2543,7 @@
     <w:lsdException w:name="Title" w:uiPriority="10" w:qFormat="1"/>
     <w:lsdException w:name="Closing" w:semiHidden="1" w:unhideWhenUsed="1"/>
     <w:lsdException w:name="Signature" w:semiHidden="1" w:unhideWhenUsed="1"/>
-    <w:lsdException w:name="Default Paragraph Font" w:uiPriority="1" w:semiHidden="1" w:unhideWhenUsed="1"/>
+    <w:lsdException w:name="Default Paragraph Font" w:semiHidden="1" w:uiPriority="1" w:unhideWhenUsed="1"/>
     <w:lsdException w:name="Body Text" w:semiHidden="1" w:unhideWhenUsed="1"/>
     <w:lsdException w:name="Body Text Indent" w:semiHidden="1" w:unhideWhenUsed="1"/>
     <w:lsdException w:name="List Continue" w:semiHidden="1" w:unhideWhenUsed="1"/>
@@ -2661,8 +2743,8 @@
     <w:lsdException w:name="Subtle Reference" w:uiPriority="31" w:qFormat="1"/>
     <w:lsdException w:name="Intense Reference" w:uiPriority="32" w:qFormat="1"/>
     <w:lsdException w:name="Book Title" w:uiPriority="33" w:qFormat="1"/>
-    <w:lsdException w:name="Bibliography" w:uiPriority="37" w:semiHidden="1" w:unhideWhenUsed="1"/>
-    <w:lsdException w:name="TOC Heading" w:uiPriority="39" w:semiHidden="1" w:unhideWhenUsed="1" w:qFormat="1"/>
+    <w:lsdException w:name="Bibliography" w:semiHidden="1" w:uiPriority="37" w:unhideWhenUsed="1"/>
+    <w:lsdException w:name="TOC Heading" w:semiHidden="1" w:uiPriority="39" w:unhideWhenUsed="1" w:qFormat="1"/>
     <w:lsdException w:name="Plain Table 1" w:uiPriority="41"/>
     <w:lsdException w:name="Plain Table 2" w:uiPriority="42"/>
     <w:lsdException w:name="Plain Table 3" w:uiPriority="43"/>
@@ -2773,16 +2855,16 @@
     <w:lsdException w:name="Unresolved Mention" w:semiHidden="1" w:unhideWhenUsed="1"/>
     <w:lsdException w:name="Smart Link" w:semiHidden="1" w:unhideWhenUsed="1"/>
   </w:latentStyles>
-  <w:style w:type="paragraph" w:styleId="Normal" w:default="1">
+  <w:style w:type="paragraph" w:default="1" w:styleId="Normal">
     <w:name w:val="Normal"/>
     <w:qFormat/>
   </w:style>
-  <w:style w:type="character" w:styleId="DefaultParagraphFont" w:default="1">
+  <w:style w:type="character" w:default="1" w:styleId="DefaultParagraphFont">
     <w:name w:val="Default Paragraph Font"/>
     <w:uiPriority w:val="1"/>
     <w:unhideWhenUsed/>
   </w:style>
-  <w:style w:type="table" w:styleId="TableNormal" w:default="1">
+  <w:style w:type="table" w:default="1" w:styleId="TableNormal">
     <w:name w:val="Normal Table"/>
     <w:uiPriority w:val="99"/>
     <w:semiHidden/>
@@ -2797,43 +2879,46 @@
       </w:tblCellMar>
     </w:tblPr>
   </w:style>
-  <w:style w:type="numbering" w:styleId="NoList" w:default="1">
+  <w:style w:type="numbering" w:default="1" w:styleId="NoList">
     <w:name w:val="No List"/>
     <w:uiPriority w:val="99"/>
     <w:semiHidden/>
     <w:unhideWhenUsed/>
   </w:style>
-  <w:style xmlns:w="http://schemas.openxmlformats.org/wordprocessingml/2006/main" w:type="table" w:styleId="TableGrid">
-    <w:name xmlns:w="http://schemas.openxmlformats.org/wordprocessingml/2006/main" w:val="Table Grid"/>
-    <w:basedOn xmlns:w="http://schemas.openxmlformats.org/wordprocessingml/2006/main" w:val="TableNormal"/>
-    <w:uiPriority xmlns:w="http://schemas.openxmlformats.org/wordprocessingml/2006/main" w:val="59"/>
-    <w:rsid xmlns:w="http://schemas.openxmlformats.org/wordprocessingml/2006/main" w:val="00FB4123"/>
-    <w:pPr xmlns:w="http://schemas.openxmlformats.org/wordprocessingml/2006/main">
+  <w:style w:type="table" w:styleId="TableGrid">
+    <w:name w:val="Table Grid"/>
+    <w:basedOn w:val="TableNormal"/>
+    <w:uiPriority w:val="59"/>
+    <w:rsid w:val="00FB4123"/>
+    <w:pPr>
       <w:spacing w:after="0" w:line="240" w:lineRule="auto"/>
     </w:pPr>
-    <w:tblPr xmlns:w="http://schemas.openxmlformats.org/wordprocessingml/2006/main">
-      <w:tblInd w:w="0" w:type="dxa"/>
+    <w:tblPr>
       <w:tblBorders>
-        <w:top w:val="single" w:color="000000" w:themeColor="text1" w:sz="4" w:space="0"/>
-        <w:left w:val="single" w:color="000000" w:themeColor="text1" w:sz="4" w:space="0"/>
-        <w:bottom w:val="single" w:color="000000" w:themeColor="text1" w:sz="4" w:space="0"/>
-        <w:right w:val="single" w:color="000000" w:themeColor="text1" w:sz="4" w:space="0"/>
-        <w:insideH w:val="single" w:color="000000" w:themeColor="text1" w:sz="4" w:space="0"/>
-        <w:insideV w:val="single" w:color="000000" w:themeColor="text1" w:sz="4" w:space="0"/>
+        <w:top w:val="single" w:sz="4" w:space="0" w:color="000000" w:themeColor="text1"/>
+        <w:left w:val="single" w:sz="4" w:space="0" w:color="000000" w:themeColor="text1"/>
+        <w:bottom w:val="single" w:sz="4" w:space="0" w:color="000000" w:themeColor="text1"/>
+        <w:right w:val="single" w:sz="4" w:space="0" w:color="000000" w:themeColor="text1"/>
+        <w:insideH w:val="single" w:sz="4" w:space="0" w:color="000000" w:themeColor="text1"/>
+        <w:insideV w:val="single" w:sz="4" w:space="0" w:color="000000" w:themeColor="text1"/>
       </w:tblBorders>
-      <w:tblCellMar>
-        <w:top w:w="0" w:type="dxa"/>
-        <w:left w:w="108" w:type="dxa"/>
-        <w:bottom w:w="0" w:type="dxa"/>
-        <w:right w:w="108" w:type="dxa"/>
-      </w:tblCellMar>
     </w:tblPr>
+  </w:style>
+  <w:style w:type="paragraph" w:styleId="Revision">
+    <w:name w:val="Revision"/>
+    <w:hidden/>
+    <w:uiPriority w:val="99"/>
+    <w:semiHidden/>
+    <w:rsid w:val="00795F3F"/>
+    <w:pPr>
+      <w:spacing w:after="0" w:line="240" w:lineRule="auto"/>
+    </w:pPr>
   </w:style>
 </w:styles>
 </file>
 
 <file path=word/theme/theme1.xml><?xml version="1.0" encoding="utf-8"?>
-<a:theme xmlns:a="http://schemas.openxmlformats.org/drawingml/2006/main" xmlns:thm15="http://schemas.microsoft.com/office/thememl/2012/main" name="Office Theme">
+<a:theme xmlns:a="http://schemas.openxmlformats.org/drawingml/2006/main" name="Office Theme">
   <a:themeElements>
     <a:clrScheme name="Office">
       <a:dk1>

</xml_diff>